<commit_message>
lab03 && lab04 - CS
</commit_message>
<xml_diff>
--- a/1_Course/2_Term/Computer_Schematics/lab_03/ЛР-3_Заварзин_ИИ-б-25-6-о.docx
+++ b/1_Course/2_Term/Computer_Schematics/lab_03/ЛР-3_Заварзин_ИИ-б-25-6-о.docx
@@ -146,323 +146,6 @@
           <w:sz w:val="28"/>
         </w:rPr>
         <w:t>Программа работы</w:t>
-      </w:r>
-    </w:p>
-    <w:p>
-      <w:pPr>
-        <w:pStyle w:val="a7"/>
-        <w:numPr>
-          <w:ilvl w:val="0"/>
-          <w:numId w:val="4"/>
-        </w:numPr>
-        <w:spacing w:line="360" w:lineRule="auto"/>
-        <w:ind w:left="0" w:firstLine="0"/>
-        <w:jc w:val="both"/>
-        <w:rPr>
-          <w:rFonts w:ascii="Times New Roman" w:hAnsi="Times New Roman" w:cs="Times New Roman"/>
-          <w:sz w:val="28"/>
-          <w:szCs w:val="28"/>
-        </w:rPr>
-      </w:pPr>
-      <w:r>
-        <w:rPr>
-          <w:rFonts w:ascii="Times New Roman" w:hAnsi="Times New Roman" w:cs="Times New Roman"/>
-          <w:sz w:val="28"/>
-          <w:szCs w:val="28"/>
-        </w:rPr>
-        <w:t xml:space="preserve">Создать на рабочем поле симулятора схему для измерения ВАХ биполярного n-p-n транзистора (Приложение А). Тип транзистора выбирается согласно варианту. В качестве источника входного сигнала использовать источник напряжения 1,5 В и потенциометр. Напряжение источника задается преподавателем согласно варианту (Приложение А). </w:t>
-      </w:r>
-    </w:p>
-    <w:p>
-      <w:pPr>
-        <w:pStyle w:val="a7"/>
-        <w:numPr>
-          <w:ilvl w:val="0"/>
-          <w:numId w:val="4"/>
-        </w:numPr>
-        <w:spacing w:line="360" w:lineRule="auto"/>
-        <w:ind w:left="0" w:firstLine="0"/>
-        <w:jc w:val="both"/>
-        <w:rPr>
-          <w:rFonts w:ascii="Times New Roman" w:hAnsi="Times New Roman" w:cs="Times New Roman"/>
-          <w:sz w:val="28"/>
-          <w:szCs w:val="28"/>
-        </w:rPr>
-      </w:pPr>
-      <w:r>
-        <w:rPr>
-          <w:rFonts w:ascii="Times New Roman" w:hAnsi="Times New Roman" w:cs="Times New Roman"/>
-          <w:sz w:val="28"/>
-          <w:szCs w:val="28"/>
-        </w:rPr>
-        <w:t xml:space="preserve">Снять зависимость тока </w:t>
-      </w:r>
-      <w:proofErr w:type="spellStart"/>
-      <w:r>
-        <w:rPr>
-          <w:rFonts w:ascii="Times New Roman" w:hAnsi="Times New Roman" w:cs="Times New Roman"/>
-          <w:sz w:val="28"/>
-          <w:szCs w:val="28"/>
-        </w:rPr>
-        <w:t>Iб</w:t>
-      </w:r>
-      <w:proofErr w:type="spellEnd"/>
-      <w:r>
-        <w:rPr>
-          <w:rFonts w:ascii="Times New Roman" w:hAnsi="Times New Roman" w:cs="Times New Roman"/>
-          <w:sz w:val="28"/>
-          <w:szCs w:val="28"/>
-        </w:rPr>
-        <w:t xml:space="preserve"> базы от напряжения </w:t>
-      </w:r>
-      <w:proofErr w:type="spellStart"/>
-      <w:r>
-        <w:rPr>
-          <w:rFonts w:ascii="Times New Roman" w:hAnsi="Times New Roman" w:cs="Times New Roman"/>
-          <w:sz w:val="28"/>
-          <w:szCs w:val="28"/>
-        </w:rPr>
-        <w:t>Uбэ</w:t>
-      </w:r>
-      <w:proofErr w:type="spellEnd"/>
-      <w:r>
-        <w:rPr>
-          <w:rFonts w:ascii="Times New Roman" w:hAnsi="Times New Roman" w:cs="Times New Roman"/>
-          <w:sz w:val="28"/>
-          <w:szCs w:val="28"/>
-        </w:rPr>
-        <w:t xml:space="preserve"> база-эмиттер. Входной ток изменять от 0 до 500 мкА.</w:t>
-      </w:r>
-    </w:p>
-    <w:p>
-      <w:pPr>
-        <w:pStyle w:val="a7"/>
-        <w:numPr>
-          <w:ilvl w:val="0"/>
-          <w:numId w:val="4"/>
-        </w:numPr>
-        <w:spacing w:line="360" w:lineRule="auto"/>
-        <w:ind w:left="0" w:firstLine="0"/>
-        <w:jc w:val="both"/>
-        <w:rPr>
-          <w:rFonts w:ascii="Times New Roman" w:hAnsi="Times New Roman" w:cs="Times New Roman"/>
-          <w:sz w:val="28"/>
-          <w:szCs w:val="28"/>
-        </w:rPr>
-      </w:pPr>
-      <w:r>
-        <w:rPr>
-          <w:rFonts w:ascii="Times New Roman" w:hAnsi="Times New Roman" w:cs="Times New Roman"/>
-          <w:sz w:val="28"/>
-          <w:szCs w:val="28"/>
-        </w:rPr>
-        <w:t xml:space="preserve">Снять зависимость тока коллектора </w:t>
-      </w:r>
-      <w:proofErr w:type="spellStart"/>
-      <w:r>
-        <w:rPr>
-          <w:rFonts w:ascii="Times New Roman" w:hAnsi="Times New Roman" w:cs="Times New Roman"/>
-          <w:sz w:val="28"/>
-          <w:szCs w:val="28"/>
-        </w:rPr>
-        <w:t>Iк</w:t>
-      </w:r>
-      <w:proofErr w:type="spellEnd"/>
-      <w:r>
-        <w:rPr>
-          <w:rFonts w:ascii="Times New Roman" w:hAnsi="Times New Roman" w:cs="Times New Roman"/>
-          <w:sz w:val="28"/>
-          <w:szCs w:val="28"/>
-        </w:rPr>
-        <w:t xml:space="preserve"> от тока базы </w:t>
-      </w:r>
-      <w:proofErr w:type="spellStart"/>
-      <w:r>
-        <w:rPr>
-          <w:rFonts w:ascii="Times New Roman" w:hAnsi="Times New Roman" w:cs="Times New Roman"/>
-          <w:sz w:val="28"/>
-          <w:szCs w:val="28"/>
-        </w:rPr>
-        <w:t>Iб</w:t>
-      </w:r>
-      <w:proofErr w:type="spellEnd"/>
-      <w:r>
-        <w:rPr>
-          <w:rFonts w:ascii="Times New Roman" w:hAnsi="Times New Roman" w:cs="Times New Roman"/>
-          <w:sz w:val="28"/>
-          <w:szCs w:val="28"/>
-        </w:rPr>
-        <w:t xml:space="preserve"> и определить коэффициент усиления транзистора по току β. </w:t>
-      </w:r>
-    </w:p>
-    <w:p>
-      <w:pPr>
-        <w:pStyle w:val="a7"/>
-        <w:numPr>
-          <w:ilvl w:val="0"/>
-          <w:numId w:val="4"/>
-        </w:numPr>
-        <w:spacing w:line="360" w:lineRule="auto"/>
-        <w:ind w:left="0" w:firstLine="0"/>
-        <w:jc w:val="both"/>
-        <w:rPr>
-          <w:rFonts w:ascii="Times New Roman" w:hAnsi="Times New Roman" w:cs="Times New Roman"/>
-          <w:sz w:val="28"/>
-          <w:szCs w:val="28"/>
-        </w:rPr>
-      </w:pPr>
-      <w:r>
-        <w:rPr>
-          <w:rFonts w:ascii="Times New Roman" w:hAnsi="Times New Roman" w:cs="Times New Roman"/>
-          <w:sz w:val="28"/>
-          <w:szCs w:val="28"/>
-        </w:rPr>
-        <w:t xml:space="preserve">Создать на рабочем поле симулятора схему транзисторного ключа (инвертора) на n-p-n транзисторе. </w:t>
-      </w:r>
-    </w:p>
-    <w:p>
-      <w:pPr>
-        <w:pStyle w:val="a7"/>
-        <w:numPr>
-          <w:ilvl w:val="0"/>
-          <w:numId w:val="4"/>
-        </w:numPr>
-        <w:spacing w:line="360" w:lineRule="auto"/>
-        <w:ind w:left="0" w:firstLine="0"/>
-        <w:jc w:val="both"/>
-        <w:rPr>
-          <w:rFonts w:ascii="Times New Roman" w:hAnsi="Times New Roman" w:cs="Times New Roman"/>
-          <w:sz w:val="28"/>
-          <w:szCs w:val="28"/>
-        </w:rPr>
-      </w:pPr>
-      <w:r>
-        <w:rPr>
-          <w:rFonts w:ascii="Times New Roman" w:hAnsi="Times New Roman" w:cs="Times New Roman"/>
-          <w:sz w:val="28"/>
-          <w:szCs w:val="28"/>
-        </w:rPr>
-        <w:t xml:space="preserve">Подключить на вход ключа генератор прямоугольных импульсов, а выход ключа соединить со входом 2-го канала осциллографа. Первый вход осциллографа подключить к генератору прямоугольных импульсов. Амплитуду импульсов установить равной 3В, форма импульсов – меандр. Длительности передних и задних фронтов – 1 </w:t>
-      </w:r>
-      <w:proofErr w:type="spellStart"/>
-      <w:r>
-        <w:rPr>
-          <w:rFonts w:ascii="Times New Roman" w:hAnsi="Times New Roman" w:cs="Times New Roman"/>
-          <w:sz w:val="28"/>
-          <w:szCs w:val="28"/>
-        </w:rPr>
-        <w:t>мкс</w:t>
-      </w:r>
-      <w:proofErr w:type="spellEnd"/>
-      <w:r>
-        <w:rPr>
-          <w:rFonts w:ascii="Times New Roman" w:hAnsi="Times New Roman" w:cs="Times New Roman"/>
-          <w:sz w:val="28"/>
-          <w:szCs w:val="28"/>
-        </w:rPr>
-        <w:t xml:space="preserve">. </w:t>
-      </w:r>
-    </w:p>
-    <w:p>
-      <w:pPr>
-        <w:pStyle w:val="a7"/>
-        <w:numPr>
-          <w:ilvl w:val="0"/>
-          <w:numId w:val="4"/>
-        </w:numPr>
-        <w:spacing w:line="360" w:lineRule="auto"/>
-        <w:ind w:left="0" w:firstLine="0"/>
-        <w:jc w:val="both"/>
-        <w:rPr>
-          <w:rFonts w:ascii="Times New Roman" w:hAnsi="Times New Roman" w:cs="Times New Roman"/>
-          <w:sz w:val="28"/>
-          <w:szCs w:val="28"/>
-        </w:rPr>
-      </w:pPr>
-      <w:r>
-        <w:rPr>
-          <w:rFonts w:ascii="Times New Roman" w:hAnsi="Times New Roman" w:cs="Times New Roman"/>
-          <w:sz w:val="28"/>
-          <w:szCs w:val="28"/>
-        </w:rPr>
-        <w:t xml:space="preserve">Снять осциллограммы входных и выходных импульсов при частотах прямоугольной последовательности 10, 50 и 100 кГц. Измерить время </w:t>
-      </w:r>
-      <w:r>
-        <w:rPr>
-          <w:rFonts w:ascii="Times New Roman" w:hAnsi="Times New Roman" w:cs="Times New Roman"/>
-          <w:sz w:val="28"/>
-          <w:szCs w:val="28"/>
-        </w:rPr>
-        <w:lastRenderedPageBreak/>
-        <w:t xml:space="preserve">задержки переключения ключа при переходе из режима отсечки в насыщение и обратно. </w:t>
-      </w:r>
-    </w:p>
-    <w:p>
-      <w:pPr>
-        <w:pStyle w:val="a7"/>
-        <w:numPr>
-          <w:ilvl w:val="0"/>
-          <w:numId w:val="4"/>
-        </w:numPr>
-        <w:spacing w:line="360" w:lineRule="auto"/>
-        <w:ind w:left="0" w:firstLine="0"/>
-        <w:jc w:val="both"/>
-        <w:rPr>
-          <w:rFonts w:ascii="Times New Roman" w:hAnsi="Times New Roman" w:cs="Times New Roman"/>
-          <w:sz w:val="28"/>
-          <w:szCs w:val="28"/>
-        </w:rPr>
-      </w:pPr>
-      <w:r>
-        <w:rPr>
-          <w:rFonts w:ascii="Times New Roman" w:hAnsi="Times New Roman" w:cs="Times New Roman"/>
-          <w:sz w:val="28"/>
-          <w:szCs w:val="28"/>
-        </w:rPr>
-        <w:t xml:space="preserve">Создать на рабочем поле симулятора схему транзисторного ключа (инвертора) на КМОП-транзисторах (см. рис. Приложения). Для этой цели использовать транзисторную пару 2SJ118 и 2SK1058. </w:t>
-      </w:r>
-    </w:p>
-    <w:p>
-      <w:pPr>
-        <w:pStyle w:val="a7"/>
-        <w:numPr>
-          <w:ilvl w:val="0"/>
-          <w:numId w:val="4"/>
-        </w:numPr>
-        <w:spacing w:line="360" w:lineRule="auto"/>
-        <w:ind w:left="0" w:firstLine="0"/>
-        <w:jc w:val="both"/>
-        <w:rPr>
-          <w:rFonts w:ascii="Times New Roman" w:hAnsi="Times New Roman" w:cs="Times New Roman"/>
-          <w:sz w:val="28"/>
-          <w:szCs w:val="28"/>
-        </w:rPr>
-      </w:pPr>
-      <w:r>
-        <w:rPr>
-          <w:rFonts w:ascii="Times New Roman" w:hAnsi="Times New Roman" w:cs="Times New Roman"/>
-          <w:sz w:val="28"/>
-          <w:szCs w:val="28"/>
-        </w:rPr>
-        <w:t xml:space="preserve">Повторить </w:t>
-      </w:r>
-      <w:proofErr w:type="spellStart"/>
-      <w:r>
-        <w:rPr>
-          <w:rFonts w:ascii="Times New Roman" w:hAnsi="Times New Roman" w:cs="Times New Roman"/>
-          <w:sz w:val="28"/>
-          <w:szCs w:val="28"/>
-        </w:rPr>
-        <w:t>пп</w:t>
-      </w:r>
-      <w:proofErr w:type="spellEnd"/>
-      <w:r>
-        <w:rPr>
-          <w:rFonts w:ascii="Times New Roman" w:hAnsi="Times New Roman" w:cs="Times New Roman"/>
-          <w:sz w:val="28"/>
-          <w:szCs w:val="28"/>
-        </w:rPr>
-        <w:t xml:space="preserve">. 5 и 6 для инвертора на КМОП-транзисторах. </w:t>
       </w:r>
     </w:p>
     <w:p>
@@ -475,6 +158,333 @@
         <w:spacing w:line="360" w:lineRule="auto"/>
         <w:ind w:left="0" w:firstLine="709"/>
         <w:jc w:val="both"/>
+        <w:rPr>
+          <w:rFonts w:ascii="Times New Roman" w:hAnsi="Times New Roman" w:cs="Times New Roman"/>
+          <w:sz w:val="28"/>
+          <w:szCs w:val="28"/>
+        </w:rPr>
+      </w:pPr>
+      <w:r>
+        <w:rPr>
+          <w:rFonts w:ascii="Times New Roman" w:hAnsi="Times New Roman" w:cs="Times New Roman"/>
+          <w:sz w:val="28"/>
+          <w:szCs w:val="28"/>
+        </w:rPr>
+        <w:t xml:space="preserve">Создать на рабочем поле симулятора схему для измерения ВАХ биполярного n-p-n транзистора (Приложение А). Тип транзистора выбирается согласно варианту. В качестве источника входного сигнала использовать источник напряжения 1,5 В и потенциометр. Напряжение источника задается преподавателем согласно варианту (Приложение А). </w:t>
+      </w:r>
+    </w:p>
+    <w:p>
+      <w:pPr>
+        <w:pStyle w:val="a7"/>
+        <w:numPr>
+          <w:ilvl w:val="0"/>
+          <w:numId w:val="4"/>
+        </w:numPr>
+        <w:spacing w:line="360" w:lineRule="auto"/>
+        <w:ind w:left="0" w:firstLine="709"/>
+        <w:jc w:val="both"/>
+        <w:rPr>
+          <w:rFonts w:ascii="Times New Roman" w:hAnsi="Times New Roman" w:cs="Times New Roman"/>
+          <w:sz w:val="28"/>
+          <w:szCs w:val="28"/>
+        </w:rPr>
+      </w:pPr>
+      <w:r>
+        <w:rPr>
+          <w:rFonts w:ascii="Times New Roman" w:hAnsi="Times New Roman" w:cs="Times New Roman"/>
+          <w:sz w:val="28"/>
+          <w:szCs w:val="28"/>
+        </w:rPr>
+        <w:t xml:space="preserve">Снять зависимость тока </w:t>
+      </w:r>
+      <w:proofErr w:type="spellStart"/>
+      <w:r>
+        <w:rPr>
+          <w:rFonts w:ascii="Times New Roman" w:hAnsi="Times New Roman" w:cs="Times New Roman"/>
+          <w:sz w:val="28"/>
+          <w:szCs w:val="28"/>
+        </w:rPr>
+        <w:t>Iб</w:t>
+      </w:r>
+      <w:proofErr w:type="spellEnd"/>
+      <w:r>
+        <w:rPr>
+          <w:rFonts w:ascii="Times New Roman" w:hAnsi="Times New Roman" w:cs="Times New Roman"/>
+          <w:sz w:val="28"/>
+          <w:szCs w:val="28"/>
+        </w:rPr>
+        <w:t xml:space="preserve"> базы от напряжения </w:t>
+      </w:r>
+      <w:proofErr w:type="spellStart"/>
+      <w:r>
+        <w:rPr>
+          <w:rFonts w:ascii="Times New Roman" w:hAnsi="Times New Roman" w:cs="Times New Roman"/>
+          <w:sz w:val="28"/>
+          <w:szCs w:val="28"/>
+        </w:rPr>
+        <w:t>Uбэ</w:t>
+      </w:r>
+      <w:proofErr w:type="spellEnd"/>
+      <w:r>
+        <w:rPr>
+          <w:rFonts w:ascii="Times New Roman" w:hAnsi="Times New Roman" w:cs="Times New Roman"/>
+          <w:sz w:val="28"/>
+          <w:szCs w:val="28"/>
+        </w:rPr>
+        <w:t xml:space="preserve"> база-эмиттер. Входной ток изменять от 0 до 500 мкА.</w:t>
+      </w:r>
+    </w:p>
+    <w:p>
+      <w:pPr>
+        <w:pStyle w:val="a7"/>
+        <w:numPr>
+          <w:ilvl w:val="0"/>
+          <w:numId w:val="4"/>
+        </w:numPr>
+        <w:spacing w:line="360" w:lineRule="auto"/>
+        <w:ind w:left="0" w:firstLine="709"/>
+        <w:jc w:val="both"/>
+        <w:rPr>
+          <w:rFonts w:ascii="Times New Roman" w:hAnsi="Times New Roman" w:cs="Times New Roman"/>
+          <w:sz w:val="28"/>
+          <w:szCs w:val="28"/>
+        </w:rPr>
+      </w:pPr>
+      <w:r>
+        <w:rPr>
+          <w:rFonts w:ascii="Times New Roman" w:hAnsi="Times New Roman" w:cs="Times New Roman"/>
+          <w:sz w:val="28"/>
+          <w:szCs w:val="28"/>
+        </w:rPr>
+        <w:t xml:space="preserve">Снять зависимость тока коллектора </w:t>
+      </w:r>
+      <w:proofErr w:type="spellStart"/>
+      <w:r>
+        <w:rPr>
+          <w:rFonts w:ascii="Times New Roman" w:hAnsi="Times New Roman" w:cs="Times New Roman"/>
+          <w:sz w:val="28"/>
+          <w:szCs w:val="28"/>
+        </w:rPr>
+        <w:t>Iк</w:t>
+      </w:r>
+      <w:proofErr w:type="spellEnd"/>
+      <w:r>
+        <w:rPr>
+          <w:rFonts w:ascii="Times New Roman" w:hAnsi="Times New Roman" w:cs="Times New Roman"/>
+          <w:sz w:val="28"/>
+          <w:szCs w:val="28"/>
+        </w:rPr>
+        <w:t xml:space="preserve"> от тока базы </w:t>
+      </w:r>
+      <w:proofErr w:type="spellStart"/>
+      <w:r>
+        <w:rPr>
+          <w:rFonts w:ascii="Times New Roman" w:hAnsi="Times New Roman" w:cs="Times New Roman"/>
+          <w:sz w:val="28"/>
+          <w:szCs w:val="28"/>
+        </w:rPr>
+        <w:t>Iб</w:t>
+      </w:r>
+      <w:proofErr w:type="spellEnd"/>
+      <w:r>
+        <w:rPr>
+          <w:rFonts w:ascii="Times New Roman" w:hAnsi="Times New Roman" w:cs="Times New Roman"/>
+          <w:sz w:val="28"/>
+          <w:szCs w:val="28"/>
+        </w:rPr>
+        <w:t xml:space="preserve"> и определить коэффициент усиления транзистора по току β. </w:t>
+      </w:r>
+    </w:p>
+    <w:p>
+      <w:pPr>
+        <w:pStyle w:val="a7"/>
+        <w:numPr>
+          <w:ilvl w:val="0"/>
+          <w:numId w:val="4"/>
+        </w:numPr>
+        <w:spacing w:line="360" w:lineRule="auto"/>
+        <w:ind w:left="0" w:firstLine="709"/>
+        <w:jc w:val="both"/>
+        <w:rPr>
+          <w:rFonts w:ascii="Times New Roman" w:hAnsi="Times New Roman" w:cs="Times New Roman"/>
+          <w:sz w:val="28"/>
+          <w:szCs w:val="28"/>
+        </w:rPr>
+      </w:pPr>
+      <w:r>
+        <w:rPr>
+          <w:rFonts w:ascii="Times New Roman" w:hAnsi="Times New Roman" w:cs="Times New Roman"/>
+          <w:sz w:val="28"/>
+          <w:szCs w:val="28"/>
+        </w:rPr>
+        <w:t xml:space="preserve">Создать на рабочем поле симулятора схему транзисторного ключа (инвертора) на n-p-n транзисторе. </w:t>
+      </w:r>
+    </w:p>
+    <w:p>
+      <w:pPr>
+        <w:pStyle w:val="a7"/>
+        <w:numPr>
+          <w:ilvl w:val="0"/>
+          <w:numId w:val="4"/>
+        </w:numPr>
+        <w:spacing w:line="360" w:lineRule="auto"/>
+        <w:ind w:left="0" w:firstLine="709"/>
+        <w:jc w:val="both"/>
+        <w:rPr>
+          <w:rFonts w:ascii="Times New Roman" w:hAnsi="Times New Roman" w:cs="Times New Roman"/>
+          <w:sz w:val="28"/>
+          <w:szCs w:val="28"/>
+        </w:rPr>
+      </w:pPr>
+      <w:r>
+        <w:rPr>
+          <w:rFonts w:ascii="Times New Roman" w:hAnsi="Times New Roman" w:cs="Times New Roman"/>
+          <w:sz w:val="28"/>
+          <w:szCs w:val="28"/>
+        </w:rPr>
+        <w:t xml:space="preserve">Подключить на вход ключа генератор прямоугольных импульсов, а выход ключа соединить со входом 2-го канала осциллографа. Первый вход осциллографа подключить к генератору прямоугольных импульсов. Амплитуду импульсов установить равной 3В, форма импульсов – меандр. Длительности передних и задних фронтов – 1 </w:t>
+      </w:r>
+      <w:proofErr w:type="spellStart"/>
+      <w:r>
+        <w:rPr>
+          <w:rFonts w:ascii="Times New Roman" w:hAnsi="Times New Roman" w:cs="Times New Roman"/>
+          <w:sz w:val="28"/>
+          <w:szCs w:val="28"/>
+        </w:rPr>
+        <w:t>мкс</w:t>
+      </w:r>
+      <w:proofErr w:type="spellEnd"/>
+      <w:r>
+        <w:rPr>
+          <w:rFonts w:ascii="Times New Roman" w:hAnsi="Times New Roman" w:cs="Times New Roman"/>
+          <w:sz w:val="28"/>
+          <w:szCs w:val="28"/>
+        </w:rPr>
+        <w:t xml:space="preserve">. </w:t>
+      </w:r>
+    </w:p>
+    <w:p>
+      <w:pPr>
+        <w:pStyle w:val="a7"/>
+        <w:numPr>
+          <w:ilvl w:val="0"/>
+          <w:numId w:val="4"/>
+        </w:numPr>
+        <w:spacing w:line="360" w:lineRule="auto"/>
+        <w:ind w:left="0" w:firstLine="709"/>
+        <w:jc w:val="both"/>
+        <w:rPr>
+          <w:rFonts w:ascii="Times New Roman" w:hAnsi="Times New Roman" w:cs="Times New Roman"/>
+          <w:sz w:val="28"/>
+          <w:szCs w:val="28"/>
+        </w:rPr>
+      </w:pPr>
+      <w:r>
+        <w:rPr>
+          <w:rFonts w:ascii="Times New Roman" w:hAnsi="Times New Roman" w:cs="Times New Roman"/>
+          <w:sz w:val="28"/>
+          <w:szCs w:val="28"/>
+        </w:rPr>
+        <w:t>Снять осциллограммы входных и выходных импульсов при частотах прямоугольной последовательности 10, 50 и 10</w:t>
+      </w:r>
+      <w:bookmarkStart w:id="0" w:name="_GoBack"/>
+      <w:bookmarkEnd w:id="0"/>
+      <w:r>
+        <w:rPr>
+          <w:rFonts w:ascii="Times New Roman" w:hAnsi="Times New Roman" w:cs="Times New Roman"/>
+          <w:sz w:val="28"/>
+          <w:szCs w:val="28"/>
+        </w:rPr>
+        <w:t xml:space="preserve">0 кГц. Измерить время </w:t>
+      </w:r>
+      <w:r>
+        <w:rPr>
+          <w:rFonts w:ascii="Times New Roman" w:hAnsi="Times New Roman" w:cs="Times New Roman"/>
+          <w:sz w:val="28"/>
+          <w:szCs w:val="28"/>
+        </w:rPr>
+        <w:lastRenderedPageBreak/>
+        <w:t xml:space="preserve">задержки переключения ключа при переходе из режима отсечки в насыщение и обратно. </w:t>
+      </w:r>
+    </w:p>
+    <w:p>
+      <w:pPr>
+        <w:pStyle w:val="a7"/>
+        <w:numPr>
+          <w:ilvl w:val="0"/>
+          <w:numId w:val="4"/>
+        </w:numPr>
+        <w:spacing w:line="360" w:lineRule="auto"/>
+        <w:ind w:left="0" w:firstLine="709"/>
+        <w:jc w:val="both"/>
+        <w:rPr>
+          <w:rFonts w:ascii="Times New Roman" w:hAnsi="Times New Roman" w:cs="Times New Roman"/>
+          <w:sz w:val="28"/>
+          <w:szCs w:val="28"/>
+        </w:rPr>
+      </w:pPr>
+      <w:r>
+        <w:rPr>
+          <w:rFonts w:ascii="Times New Roman" w:hAnsi="Times New Roman" w:cs="Times New Roman"/>
+          <w:sz w:val="28"/>
+          <w:szCs w:val="28"/>
+        </w:rPr>
+        <w:t xml:space="preserve">Создать на рабочем поле симулятора схему транзисторного ключа (инвертора) на КМОП-транзисторах (см. рис. Приложения). Для этой цели использовать транзисторную пару 2SJ118 и 2SK1058. </w:t>
+      </w:r>
+    </w:p>
+    <w:p>
+      <w:pPr>
+        <w:pStyle w:val="a7"/>
+        <w:numPr>
+          <w:ilvl w:val="0"/>
+          <w:numId w:val="4"/>
+        </w:numPr>
+        <w:spacing w:line="360" w:lineRule="auto"/>
+        <w:ind w:left="0" w:firstLine="709"/>
+        <w:jc w:val="both"/>
+        <w:rPr>
+          <w:rFonts w:ascii="Times New Roman" w:hAnsi="Times New Roman" w:cs="Times New Roman"/>
+          <w:sz w:val="28"/>
+          <w:szCs w:val="28"/>
+        </w:rPr>
+      </w:pPr>
+      <w:r>
+        <w:rPr>
+          <w:rFonts w:ascii="Times New Roman" w:hAnsi="Times New Roman" w:cs="Times New Roman"/>
+          <w:sz w:val="28"/>
+          <w:szCs w:val="28"/>
+        </w:rPr>
+        <w:t xml:space="preserve">Повторить </w:t>
+      </w:r>
+      <w:proofErr w:type="spellStart"/>
+      <w:r>
+        <w:rPr>
+          <w:rFonts w:ascii="Times New Roman" w:hAnsi="Times New Roman" w:cs="Times New Roman"/>
+          <w:sz w:val="28"/>
+          <w:szCs w:val="28"/>
+        </w:rPr>
+        <w:t>пп</w:t>
+      </w:r>
+      <w:proofErr w:type="spellEnd"/>
+      <w:r>
+        <w:rPr>
+          <w:rFonts w:ascii="Times New Roman" w:hAnsi="Times New Roman" w:cs="Times New Roman"/>
+          <w:sz w:val="28"/>
+          <w:szCs w:val="28"/>
+        </w:rPr>
+        <w:t xml:space="preserve">. 5 и 6 для инвертора на КМОП-транзисторах. </w:t>
+      </w:r>
+    </w:p>
+    <w:p>
+      <w:pPr>
+        <w:pStyle w:val="a7"/>
+        <w:numPr>
+          <w:ilvl w:val="0"/>
+          <w:numId w:val="4"/>
+        </w:numPr>
+        <w:spacing w:line="360" w:lineRule="auto"/>
+        <w:ind w:left="0" w:firstLine="709"/>
+        <w:jc w:val="both"/>
       </w:pPr>
       <w:r>
         <w:rPr>
@@ -525,7 +535,16 @@
           <w:sz w:val="28"/>
           <w:szCs w:val="28"/>
         </w:rPr>
-        <w:t>Порядок выполнения работы</w:t>
+        <w:t>Ход</w:t>
+      </w:r>
+      <w:r>
+        <w:rPr>
+          <w:rFonts w:ascii="Times New Roman" w:eastAsiaTheme="minorEastAsia" w:hAnsi="Times New Roman" w:cs="Times New Roman"/>
+          <w:b/>
+          <w:sz w:val="28"/>
+          <w:szCs w:val="28"/>
+        </w:rPr>
+        <w:t xml:space="preserve"> выполнения работы</w:t>
       </w:r>
     </w:p>
     <w:p>
@@ -848,8 +867,10 @@
       <w:r>
         <w:rPr>
           <w:rFonts w:ascii="Times New Roman" w:hAnsi="Times New Roman" w:cs="Times New Roman"/>
-          <w:sz w:val="28"/>
-          <w:szCs w:val="28"/>
+          <w:noProof/>
+          <w:sz w:val="28"/>
+          <w:szCs w:val="28"/>
+          <w:lang w:eastAsia="ru-RU"/>
         </w:rPr>
         <w:drawing>
           <wp:inline distT="0" distB="0" distL="0" distR="0" wp14:anchorId="57EC4457" wp14:editId="529F91EF">
@@ -867,7 +888,7 @@
                     <pic:cNvPicPr/>
                   </pic:nvPicPr>
                   <pic:blipFill>
-                    <a:blip r:embed="rId5"/>
+                    <a:blip r:embed="rId6"/>
                     <a:stretch>
                       <a:fillRect/>
                     </a:stretch>
@@ -887,8 +908,6 @@
           </wp:inline>
         </w:drawing>
       </w:r>
-      <w:bookmarkStart w:id="0" w:name="_GoBack"/>
-      <w:bookmarkEnd w:id="0"/>
       <w:r>
         <w:rPr>
           <w:rFonts w:ascii="Times New Roman" w:hAnsi="Times New Roman" w:cs="Times New Roman"/>
@@ -898,21 +917,1065 @@
         <w:br/>
       </w:r>
       <w:r>
+        <w:rPr>
+          <w:rFonts w:ascii="Times New Roman" w:hAnsi="Times New Roman" w:cs="Times New Roman"/>
+          <w:sz w:val="24"/>
+        </w:rPr>
+        <w:t xml:space="preserve">Рисунок 1 – Схема </w:t>
+      </w:r>
+      <w:r>
+        <w:rPr>
+          <w:rFonts w:ascii="Times New Roman" w:hAnsi="Times New Roman" w:cs="Times New Roman"/>
+          <w:sz w:val="24"/>
+        </w:rPr>
+        <w:t>измерения ВАХ биполярного n-p-n транзистора</w:t>
+      </w:r>
+      <w:r>
+        <w:rPr>
+          <w:rFonts w:ascii="Times New Roman" w:hAnsi="Times New Roman" w:cs="Times New Roman"/>
+          <w:sz w:val="24"/>
+        </w:rPr>
+        <w:t xml:space="preserve"> согласно варианту №4</w:t>
+      </w:r>
+    </w:p>
+    <w:tbl>
+      <w:tblPr>
+        <w:tblStyle w:val="ac"/>
+        <w:tblW w:w="0" w:type="auto"/>
+        <w:jc w:val="center"/>
+        <w:tblLook w:val="04A0" w:firstRow="1" w:lastRow="0" w:firstColumn="1" w:lastColumn="0" w:noHBand="0" w:noVBand="1"/>
+      </w:tblPr>
+      <w:tblGrid>
+        <w:gridCol w:w="2378"/>
+        <w:gridCol w:w="2402"/>
+        <w:gridCol w:w="2358"/>
+      </w:tblGrid>
+      <w:tr>
+        <w:trPr>
+          <w:jc w:val="center"/>
+        </w:trPr>
+        <w:tc>
+          <w:tcPr>
+            <w:tcW w:w="2378" w:type="dxa"/>
+          </w:tcPr>
+          <w:p>
+            <w:pPr>
+              <w:spacing w:after="120" w:line="360" w:lineRule="auto"/>
+              <w:jc w:val="center"/>
+              <w:rPr>
+                <w:rFonts w:ascii="Times New Roman" w:hAnsi="Times New Roman" w:cs="Times New Roman"/>
+                <w:b/>
+                <w:sz w:val="28"/>
+                <w:szCs w:val="28"/>
+              </w:rPr>
+            </w:pPr>
+            <w:r>
+              <w:rPr>
+                <w:rFonts w:ascii="Times New Roman" w:hAnsi="Times New Roman" w:cs="Times New Roman"/>
+                <w:b/>
+                <w:sz w:val="28"/>
+                <w:szCs w:val="28"/>
+                <w:lang w:val="en-US"/>
+              </w:rPr>
+              <w:lastRenderedPageBreak/>
+              <w:t>I</w:t>
+            </w:r>
+            <w:r>
+              <w:rPr>
+                <w:rFonts w:ascii="Times New Roman" w:hAnsi="Times New Roman" w:cs="Times New Roman"/>
+                <w:b/>
+                <w:sz w:val="28"/>
+                <w:szCs w:val="28"/>
+                <w:vertAlign w:val="subscript"/>
+              </w:rPr>
+              <w:t>б</w:t>
+            </w:r>
+            <w:r>
+              <w:rPr>
+                <w:rFonts w:ascii="Times New Roman" w:hAnsi="Times New Roman" w:cs="Times New Roman"/>
+                <w:b/>
+                <w:sz w:val="28"/>
+                <w:szCs w:val="28"/>
+              </w:rPr>
+              <w:t>, мкА</w:t>
+            </w:r>
+          </w:p>
+        </w:tc>
+        <w:tc>
+          <w:tcPr>
+            <w:tcW w:w="2402" w:type="dxa"/>
+          </w:tcPr>
+          <w:p>
+            <w:pPr>
+              <w:spacing w:after="120" w:line="360" w:lineRule="auto"/>
+              <w:jc w:val="center"/>
+              <w:rPr>
+                <w:rFonts w:ascii="Times New Roman" w:hAnsi="Times New Roman" w:cs="Times New Roman"/>
+                <w:b/>
+                <w:sz w:val="28"/>
+                <w:szCs w:val="28"/>
+              </w:rPr>
+            </w:pPr>
+            <w:r>
+              <w:rPr>
+                <w:rFonts w:ascii="Times New Roman" w:hAnsi="Times New Roman" w:cs="Times New Roman"/>
+                <w:b/>
+                <w:sz w:val="28"/>
+                <w:szCs w:val="28"/>
+                <w:lang w:val="en-US"/>
+              </w:rPr>
+              <w:t>U</w:t>
+            </w:r>
+            <w:r>
+              <w:rPr>
+                <w:rFonts w:ascii="Times New Roman" w:hAnsi="Times New Roman" w:cs="Times New Roman"/>
+                <w:b/>
+                <w:sz w:val="28"/>
+                <w:szCs w:val="28"/>
+                <w:vertAlign w:val="subscript"/>
+              </w:rPr>
+              <w:t>бэ</w:t>
+            </w:r>
+            <w:r>
+              <w:rPr>
+                <w:rFonts w:ascii="Times New Roman" w:hAnsi="Times New Roman" w:cs="Times New Roman"/>
+                <w:b/>
+                <w:sz w:val="28"/>
+                <w:szCs w:val="28"/>
+              </w:rPr>
+              <w:t>, В</w:t>
+            </w:r>
+          </w:p>
+        </w:tc>
+        <w:tc>
+          <w:tcPr>
+            <w:tcW w:w="2358" w:type="dxa"/>
+          </w:tcPr>
+          <w:p>
+            <w:pPr>
+              <w:spacing w:after="120" w:line="360" w:lineRule="auto"/>
+              <w:jc w:val="center"/>
+              <w:rPr>
+                <w:rFonts w:ascii="Times New Roman" w:hAnsi="Times New Roman" w:cs="Times New Roman"/>
+                <w:b/>
+                <w:sz w:val="28"/>
+                <w:szCs w:val="28"/>
+              </w:rPr>
+            </w:pPr>
+            <w:r>
+              <w:rPr>
+                <w:rFonts w:ascii="Times New Roman" w:hAnsi="Times New Roman" w:cs="Times New Roman"/>
+                <w:b/>
+                <w:sz w:val="28"/>
+                <w:szCs w:val="28"/>
+                <w:lang w:val="en-US"/>
+              </w:rPr>
+              <w:t>I</w:t>
+            </w:r>
+            <w:r>
+              <w:rPr>
+                <w:rFonts w:ascii="Times New Roman" w:hAnsi="Times New Roman" w:cs="Times New Roman"/>
+                <w:b/>
+                <w:sz w:val="28"/>
+                <w:szCs w:val="28"/>
+                <w:vertAlign w:val="subscript"/>
+              </w:rPr>
+              <w:t>к</w:t>
+            </w:r>
+            <w:r>
+              <w:rPr>
+                <w:rFonts w:ascii="Times New Roman" w:hAnsi="Times New Roman" w:cs="Times New Roman"/>
+                <w:b/>
+                <w:sz w:val="28"/>
+                <w:szCs w:val="28"/>
+              </w:rPr>
+              <w:t>, мА</w:t>
+            </w:r>
+          </w:p>
+        </w:tc>
+      </w:tr>
+      <w:tr>
+        <w:trPr>
+          <w:jc w:val="center"/>
+        </w:trPr>
+        <w:tc>
+          <w:tcPr>
+            <w:tcW w:w="2378" w:type="dxa"/>
+          </w:tcPr>
+          <w:p>
+            <w:pPr>
+              <w:spacing w:after="120" w:line="360" w:lineRule="auto"/>
+              <w:jc w:val="center"/>
+              <w:rPr>
+                <w:rFonts w:ascii="Times New Roman" w:hAnsi="Times New Roman" w:cs="Times New Roman"/>
+                <w:sz w:val="28"/>
+                <w:szCs w:val="28"/>
+                <w:lang w:val="en-US"/>
+              </w:rPr>
+            </w:pPr>
+            <w:r>
+              <w:rPr>
+                <w:rFonts w:ascii="Times New Roman" w:hAnsi="Times New Roman" w:cs="Times New Roman"/>
+                <w:sz w:val="28"/>
+                <w:szCs w:val="28"/>
+                <w:lang w:val="en-US"/>
+              </w:rPr>
+              <w:t>0</w:t>
+            </w:r>
+          </w:p>
+        </w:tc>
+        <w:tc>
+          <w:tcPr>
+            <w:tcW w:w="2402" w:type="dxa"/>
+          </w:tcPr>
+          <w:p>
+            <w:pPr>
+              <w:spacing w:after="120" w:line="360" w:lineRule="auto"/>
+              <w:jc w:val="center"/>
+              <w:rPr>
+                <w:rFonts w:ascii="Times New Roman" w:hAnsi="Times New Roman" w:cs="Times New Roman"/>
+                <w:sz w:val="28"/>
+                <w:szCs w:val="28"/>
+              </w:rPr>
+            </w:pPr>
+            <w:r>
+              <w:rPr>
+                <w:rFonts w:ascii="Times New Roman" w:hAnsi="Times New Roman" w:cs="Times New Roman"/>
+                <w:sz w:val="28"/>
+                <w:szCs w:val="28"/>
+              </w:rPr>
+              <w:t>0</w:t>
+            </w:r>
+          </w:p>
+        </w:tc>
+        <w:tc>
+          <w:tcPr>
+            <w:tcW w:w="2358" w:type="dxa"/>
+          </w:tcPr>
+          <w:p>
+            <w:pPr>
+              <w:spacing w:after="120" w:line="360" w:lineRule="auto"/>
+              <w:jc w:val="center"/>
+              <w:rPr>
+                <w:rFonts w:ascii="Times New Roman" w:hAnsi="Times New Roman" w:cs="Times New Roman"/>
+                <w:sz w:val="28"/>
+                <w:szCs w:val="28"/>
+              </w:rPr>
+            </w:pPr>
+            <w:r>
+              <w:rPr>
+                <w:rFonts w:ascii="Times New Roman" w:hAnsi="Times New Roman" w:cs="Times New Roman"/>
+                <w:sz w:val="28"/>
+                <w:szCs w:val="28"/>
+              </w:rPr>
+              <w:t>0</w:t>
+            </w:r>
+          </w:p>
+        </w:tc>
+      </w:tr>
+      <w:tr>
+        <w:trPr>
+          <w:jc w:val="center"/>
+        </w:trPr>
+        <w:tc>
+          <w:tcPr>
+            <w:tcW w:w="2378" w:type="dxa"/>
+          </w:tcPr>
+          <w:p>
+            <w:pPr>
+              <w:spacing w:after="120" w:line="360" w:lineRule="auto"/>
+              <w:jc w:val="center"/>
+              <w:rPr>
+                <w:rFonts w:ascii="Times New Roman" w:hAnsi="Times New Roman" w:cs="Times New Roman"/>
+                <w:sz w:val="28"/>
+                <w:szCs w:val="28"/>
+              </w:rPr>
+            </w:pPr>
+            <w:r>
+              <w:rPr>
+                <w:rFonts w:ascii="Times New Roman" w:hAnsi="Times New Roman" w:cs="Times New Roman"/>
+                <w:sz w:val="28"/>
+                <w:szCs w:val="28"/>
+              </w:rPr>
+              <w:t>10</w:t>
+            </w:r>
+          </w:p>
+        </w:tc>
+        <w:tc>
+          <w:tcPr>
+            <w:tcW w:w="2402" w:type="dxa"/>
+          </w:tcPr>
+          <w:p>
+            <w:pPr>
+              <w:spacing w:after="120" w:line="360" w:lineRule="auto"/>
+              <w:jc w:val="center"/>
+              <w:rPr>
+                <w:rFonts w:ascii="Times New Roman" w:hAnsi="Times New Roman" w:cs="Times New Roman"/>
+                <w:sz w:val="28"/>
+                <w:szCs w:val="28"/>
+              </w:rPr>
+            </w:pPr>
+            <w:r>
+              <w:rPr>
+                <w:rFonts w:ascii="Times New Roman" w:hAnsi="Times New Roman" w:cs="Times New Roman"/>
+                <w:sz w:val="28"/>
+                <w:szCs w:val="28"/>
+              </w:rPr>
+              <w:t>0,55</w:t>
+            </w:r>
+          </w:p>
+        </w:tc>
+        <w:tc>
+          <w:tcPr>
+            <w:tcW w:w="2358" w:type="dxa"/>
+            <w:shd w:val="clear" w:color="auto" w:fill="auto"/>
+          </w:tcPr>
+          <w:p>
+            <w:pPr>
+              <w:spacing w:after="120" w:line="360" w:lineRule="auto"/>
+              <w:jc w:val="center"/>
+              <w:rPr>
+                <w:rFonts w:ascii="Times New Roman" w:hAnsi="Times New Roman" w:cs="Times New Roman"/>
+                <w:sz w:val="28"/>
+                <w:szCs w:val="28"/>
+              </w:rPr>
+            </w:pPr>
+            <w:r>
+              <w:rPr>
+                <w:rFonts w:ascii="Times New Roman" w:hAnsi="Times New Roman" w:cs="Times New Roman"/>
+                <w:sz w:val="28"/>
+                <w:szCs w:val="28"/>
+              </w:rPr>
+              <w:t>1,5</w:t>
+            </w:r>
+          </w:p>
+        </w:tc>
+      </w:tr>
+      <w:tr>
+        <w:trPr>
+          <w:jc w:val="center"/>
+        </w:trPr>
+        <w:tc>
+          <w:tcPr>
+            <w:tcW w:w="2378" w:type="dxa"/>
+          </w:tcPr>
+          <w:p>
+            <w:pPr>
+              <w:spacing w:after="120" w:line="360" w:lineRule="auto"/>
+              <w:jc w:val="center"/>
+              <w:rPr>
+                <w:rFonts w:ascii="Times New Roman" w:hAnsi="Times New Roman" w:cs="Times New Roman"/>
+                <w:sz w:val="28"/>
+                <w:szCs w:val="28"/>
+              </w:rPr>
+            </w:pPr>
+            <w:r>
+              <w:rPr>
+                <w:rFonts w:ascii="Times New Roman" w:hAnsi="Times New Roman" w:cs="Times New Roman"/>
+                <w:sz w:val="28"/>
+                <w:szCs w:val="28"/>
+              </w:rPr>
+              <w:t>20</w:t>
+            </w:r>
+          </w:p>
+        </w:tc>
+        <w:tc>
+          <w:tcPr>
+            <w:tcW w:w="2402" w:type="dxa"/>
+          </w:tcPr>
+          <w:p>
+            <w:pPr>
+              <w:spacing w:after="120" w:line="360" w:lineRule="auto"/>
+              <w:jc w:val="center"/>
+              <w:rPr>
+                <w:rFonts w:ascii="Times New Roman" w:hAnsi="Times New Roman" w:cs="Times New Roman"/>
+                <w:sz w:val="28"/>
+                <w:szCs w:val="28"/>
+              </w:rPr>
+            </w:pPr>
+            <w:r>
+              <w:rPr>
+                <w:rFonts w:ascii="Times New Roman" w:hAnsi="Times New Roman" w:cs="Times New Roman"/>
+                <w:sz w:val="28"/>
+                <w:szCs w:val="28"/>
+              </w:rPr>
+              <w:t>0,6</w:t>
+            </w:r>
+          </w:p>
+        </w:tc>
+        <w:tc>
+          <w:tcPr>
+            <w:tcW w:w="2358" w:type="dxa"/>
+            <w:shd w:val="clear" w:color="auto" w:fill="auto"/>
+          </w:tcPr>
+          <w:p>
+            <w:pPr>
+              <w:spacing w:after="120" w:line="360" w:lineRule="auto"/>
+              <w:jc w:val="center"/>
+              <w:rPr>
+                <w:rFonts w:ascii="Times New Roman" w:hAnsi="Times New Roman" w:cs="Times New Roman"/>
+                <w:sz w:val="28"/>
+                <w:szCs w:val="28"/>
+              </w:rPr>
+            </w:pPr>
+            <w:r>
+              <w:rPr>
+                <w:rFonts w:ascii="Times New Roman" w:hAnsi="Times New Roman" w:cs="Times New Roman"/>
+                <w:sz w:val="28"/>
+                <w:szCs w:val="28"/>
+              </w:rPr>
+              <w:t>3,0</w:t>
+            </w:r>
+          </w:p>
+        </w:tc>
+      </w:tr>
+      <w:tr>
+        <w:trPr>
+          <w:jc w:val="center"/>
+        </w:trPr>
+        <w:tc>
+          <w:tcPr>
+            <w:tcW w:w="2378" w:type="dxa"/>
+          </w:tcPr>
+          <w:p>
+            <w:pPr>
+              <w:spacing w:after="120" w:line="360" w:lineRule="auto"/>
+              <w:jc w:val="center"/>
+              <w:rPr>
+                <w:rFonts w:ascii="Times New Roman" w:hAnsi="Times New Roman" w:cs="Times New Roman"/>
+                <w:sz w:val="28"/>
+                <w:szCs w:val="28"/>
+              </w:rPr>
+            </w:pPr>
+            <w:r>
+              <w:rPr>
+                <w:rFonts w:ascii="Times New Roman" w:hAnsi="Times New Roman" w:cs="Times New Roman"/>
+                <w:sz w:val="28"/>
+                <w:szCs w:val="28"/>
+              </w:rPr>
+              <w:t>50</w:t>
+            </w:r>
+          </w:p>
+        </w:tc>
+        <w:tc>
+          <w:tcPr>
+            <w:tcW w:w="2402" w:type="dxa"/>
+          </w:tcPr>
+          <w:p>
+            <w:pPr>
+              <w:spacing w:after="120" w:line="360" w:lineRule="auto"/>
+              <w:jc w:val="center"/>
+              <w:rPr>
+                <w:rFonts w:ascii="Times New Roman" w:hAnsi="Times New Roman" w:cs="Times New Roman"/>
+                <w:sz w:val="28"/>
+                <w:szCs w:val="28"/>
+              </w:rPr>
+            </w:pPr>
+            <w:r>
+              <w:rPr>
+                <w:rFonts w:ascii="Times New Roman" w:hAnsi="Times New Roman" w:cs="Times New Roman"/>
+                <w:sz w:val="28"/>
+                <w:szCs w:val="28"/>
+              </w:rPr>
+              <w:t>0,65</w:t>
+            </w:r>
+          </w:p>
+        </w:tc>
+        <w:tc>
+          <w:tcPr>
+            <w:tcW w:w="2358" w:type="dxa"/>
+            <w:shd w:val="clear" w:color="auto" w:fill="auto"/>
+          </w:tcPr>
+          <w:p>
+            <w:pPr>
+              <w:spacing w:after="120" w:line="360" w:lineRule="auto"/>
+              <w:jc w:val="center"/>
+              <w:rPr>
+                <w:rFonts w:ascii="Times New Roman" w:hAnsi="Times New Roman" w:cs="Times New Roman"/>
+                <w:sz w:val="28"/>
+                <w:szCs w:val="28"/>
+              </w:rPr>
+            </w:pPr>
+            <w:r>
+              <w:rPr>
+                <w:rFonts w:ascii="Times New Roman" w:hAnsi="Times New Roman" w:cs="Times New Roman"/>
+                <w:sz w:val="28"/>
+                <w:szCs w:val="28"/>
+              </w:rPr>
+              <w:t>7,5</w:t>
+            </w:r>
+          </w:p>
+        </w:tc>
+      </w:tr>
+      <w:tr>
+        <w:trPr>
+          <w:jc w:val="center"/>
+        </w:trPr>
+        <w:tc>
+          <w:tcPr>
+            <w:tcW w:w="2378" w:type="dxa"/>
+          </w:tcPr>
+          <w:p>
+            <w:pPr>
+              <w:spacing w:after="120" w:line="360" w:lineRule="auto"/>
+              <w:jc w:val="center"/>
+              <w:rPr>
+                <w:rFonts w:ascii="Times New Roman" w:hAnsi="Times New Roman" w:cs="Times New Roman"/>
+                <w:sz w:val="28"/>
+                <w:szCs w:val="28"/>
+              </w:rPr>
+            </w:pPr>
+            <w:r>
+              <w:rPr>
+                <w:rFonts w:ascii="Times New Roman" w:hAnsi="Times New Roman" w:cs="Times New Roman"/>
+                <w:sz w:val="28"/>
+                <w:szCs w:val="28"/>
+              </w:rPr>
+              <w:t>100</w:t>
+            </w:r>
+          </w:p>
+        </w:tc>
+        <w:tc>
+          <w:tcPr>
+            <w:tcW w:w="2402" w:type="dxa"/>
+          </w:tcPr>
+          <w:p>
+            <w:pPr>
+              <w:spacing w:after="120" w:line="360" w:lineRule="auto"/>
+              <w:jc w:val="center"/>
+              <w:rPr>
+                <w:rFonts w:ascii="Times New Roman" w:hAnsi="Times New Roman" w:cs="Times New Roman"/>
+                <w:sz w:val="28"/>
+                <w:szCs w:val="28"/>
+              </w:rPr>
+            </w:pPr>
+            <w:r>
+              <w:rPr>
+                <w:rFonts w:ascii="Times New Roman" w:hAnsi="Times New Roman" w:cs="Times New Roman"/>
+                <w:sz w:val="28"/>
+                <w:szCs w:val="28"/>
+              </w:rPr>
+              <w:t>0,68</w:t>
+            </w:r>
+          </w:p>
+        </w:tc>
+        <w:tc>
+          <w:tcPr>
+            <w:tcW w:w="2358" w:type="dxa"/>
+            <w:shd w:val="clear" w:color="auto" w:fill="auto"/>
+          </w:tcPr>
+          <w:p>
+            <w:pPr>
+              <w:spacing w:after="120" w:line="360" w:lineRule="auto"/>
+              <w:jc w:val="center"/>
+              <w:rPr>
+                <w:rFonts w:ascii="Times New Roman" w:hAnsi="Times New Roman" w:cs="Times New Roman"/>
+                <w:sz w:val="28"/>
+                <w:szCs w:val="28"/>
+              </w:rPr>
+            </w:pPr>
+            <w:r>
+              <w:rPr>
+                <w:rFonts w:ascii="Times New Roman" w:hAnsi="Times New Roman" w:cs="Times New Roman"/>
+                <w:sz w:val="28"/>
+                <w:szCs w:val="28"/>
+              </w:rPr>
+              <w:t>15,0</w:t>
+            </w:r>
+          </w:p>
+        </w:tc>
+      </w:tr>
+      <w:tr>
+        <w:trPr>
+          <w:jc w:val="center"/>
+        </w:trPr>
+        <w:tc>
+          <w:tcPr>
+            <w:tcW w:w="2378" w:type="dxa"/>
+          </w:tcPr>
+          <w:p>
+            <w:pPr>
+              <w:spacing w:after="120" w:line="360" w:lineRule="auto"/>
+              <w:jc w:val="center"/>
+              <w:rPr>
+                <w:rFonts w:ascii="Times New Roman" w:hAnsi="Times New Roman" w:cs="Times New Roman"/>
+                <w:sz w:val="28"/>
+                <w:szCs w:val="28"/>
+              </w:rPr>
+            </w:pPr>
+            <w:r>
+              <w:rPr>
+                <w:rFonts w:ascii="Times New Roman" w:hAnsi="Times New Roman" w:cs="Times New Roman"/>
+                <w:sz w:val="28"/>
+                <w:szCs w:val="28"/>
+              </w:rPr>
+              <w:t>250</w:t>
+            </w:r>
+          </w:p>
+        </w:tc>
+        <w:tc>
+          <w:tcPr>
+            <w:tcW w:w="2402" w:type="dxa"/>
+          </w:tcPr>
+          <w:p>
+            <w:pPr>
+              <w:spacing w:after="120" w:line="360" w:lineRule="auto"/>
+              <w:jc w:val="center"/>
+              <w:rPr>
+                <w:rFonts w:ascii="Times New Roman" w:hAnsi="Times New Roman" w:cs="Times New Roman"/>
+                <w:sz w:val="28"/>
+                <w:szCs w:val="28"/>
+              </w:rPr>
+            </w:pPr>
+            <w:r>
+              <w:rPr>
+                <w:rFonts w:ascii="Times New Roman" w:hAnsi="Times New Roman" w:cs="Times New Roman"/>
+                <w:sz w:val="28"/>
+                <w:szCs w:val="28"/>
+              </w:rPr>
+              <w:t>0,725</w:t>
+            </w:r>
+          </w:p>
+        </w:tc>
+        <w:tc>
+          <w:tcPr>
+            <w:tcW w:w="2358" w:type="dxa"/>
+            <w:shd w:val="clear" w:color="auto" w:fill="auto"/>
+          </w:tcPr>
+          <w:p>
+            <w:pPr>
+              <w:spacing w:after="120" w:line="360" w:lineRule="auto"/>
+              <w:jc w:val="center"/>
+              <w:rPr>
+                <w:rFonts w:ascii="Times New Roman" w:hAnsi="Times New Roman" w:cs="Times New Roman"/>
+                <w:sz w:val="28"/>
+                <w:szCs w:val="28"/>
+              </w:rPr>
+            </w:pPr>
+            <w:r>
+              <w:rPr>
+                <w:rFonts w:ascii="Times New Roman" w:hAnsi="Times New Roman" w:cs="Times New Roman"/>
+                <w:sz w:val="28"/>
+                <w:szCs w:val="28"/>
+              </w:rPr>
+              <w:t>37,5</w:t>
+            </w:r>
+          </w:p>
+        </w:tc>
+      </w:tr>
+      <w:tr>
+        <w:trPr>
+          <w:jc w:val="center"/>
+        </w:trPr>
+        <w:tc>
+          <w:tcPr>
+            <w:tcW w:w="2378" w:type="dxa"/>
+          </w:tcPr>
+          <w:p>
+            <w:pPr>
+              <w:spacing w:after="120" w:line="360" w:lineRule="auto"/>
+              <w:jc w:val="center"/>
+              <w:rPr>
+                <w:rFonts w:ascii="Times New Roman" w:hAnsi="Times New Roman" w:cs="Times New Roman"/>
+                <w:sz w:val="28"/>
+                <w:szCs w:val="28"/>
+              </w:rPr>
+            </w:pPr>
+            <w:r>
+              <w:rPr>
+                <w:rFonts w:ascii="Times New Roman" w:hAnsi="Times New Roman" w:cs="Times New Roman"/>
+                <w:sz w:val="28"/>
+                <w:szCs w:val="28"/>
+              </w:rPr>
+              <w:t>500</w:t>
+            </w:r>
+          </w:p>
+        </w:tc>
+        <w:tc>
+          <w:tcPr>
+            <w:tcW w:w="2402" w:type="dxa"/>
+          </w:tcPr>
+          <w:p>
+            <w:pPr>
+              <w:spacing w:after="120" w:line="360" w:lineRule="auto"/>
+              <w:jc w:val="center"/>
+              <w:rPr>
+                <w:rFonts w:ascii="Times New Roman" w:hAnsi="Times New Roman" w:cs="Times New Roman"/>
+                <w:sz w:val="28"/>
+                <w:szCs w:val="28"/>
+              </w:rPr>
+            </w:pPr>
+            <w:r>
+              <w:rPr>
+                <w:rFonts w:ascii="Times New Roman" w:hAnsi="Times New Roman" w:cs="Times New Roman"/>
+                <w:sz w:val="28"/>
+                <w:szCs w:val="28"/>
+              </w:rPr>
+              <w:t>0,765</w:t>
+            </w:r>
+          </w:p>
+        </w:tc>
+        <w:tc>
+          <w:tcPr>
+            <w:tcW w:w="2358" w:type="dxa"/>
+            <w:shd w:val="clear" w:color="auto" w:fill="auto"/>
+          </w:tcPr>
+          <w:p>
+            <w:pPr>
+              <w:spacing w:after="120" w:line="360" w:lineRule="auto"/>
+              <w:jc w:val="center"/>
+              <w:rPr>
+                <w:rFonts w:ascii="Times New Roman" w:hAnsi="Times New Roman" w:cs="Times New Roman"/>
+                <w:sz w:val="28"/>
+                <w:szCs w:val="28"/>
+              </w:rPr>
+            </w:pPr>
+            <w:r>
+              <w:rPr>
+                <w:rFonts w:ascii="Times New Roman" w:hAnsi="Times New Roman" w:cs="Times New Roman"/>
+                <w:sz w:val="28"/>
+                <w:szCs w:val="28"/>
+              </w:rPr>
+              <w:t>75,0</w:t>
+            </w:r>
+          </w:p>
+        </w:tc>
+      </w:tr>
+    </w:tbl>
+    <w:p>
+      <w:pPr>
+        <w:spacing w:after="120" w:line="360" w:lineRule="auto"/>
+        <w:ind w:firstLine="357"/>
+        <w:jc w:val="both"/>
+        <w:rPr>
+          <w:rFonts w:ascii="Times New Roman" w:hAnsi="Times New Roman" w:cs="Times New Roman"/>
+          <w:sz w:val="28"/>
+          <w:szCs w:val="28"/>
+        </w:rPr>
+      </w:pPr>
+    </w:p>
+    <w:p>
+      <w:pPr>
+        <w:spacing w:after="120" w:line="360" w:lineRule="auto"/>
+        <w:ind w:firstLine="357"/>
+        <w:jc w:val="both"/>
+        <w:rPr>
+          <w:rFonts w:ascii="Times New Roman" w:hAnsi="Times New Roman" w:cs="Times New Roman"/>
+          <w:sz w:val="28"/>
+          <w:szCs w:val="28"/>
+        </w:rPr>
+      </w:pPr>
+      <w:r>
+        <w:rPr>
+          <w:rFonts w:ascii="Times New Roman" w:hAnsi="Times New Roman" w:cs="Times New Roman"/>
+          <w:sz w:val="28"/>
+          <w:szCs w:val="28"/>
+        </w:rPr>
+        <w:t xml:space="preserve">Теперь рассчитаем </w:t>
+      </w:r>
+      <w:r>
+        <w:rPr>
+          <w:rFonts w:ascii="Times New Roman" w:hAnsi="Times New Roman" w:cs="Times New Roman"/>
+          <w:sz w:val="28"/>
+          <w:szCs w:val="28"/>
+        </w:rPr>
+        <w:t>коэффициент усиления β. Расчёт был произведён для линейного участка между I</w:t>
+      </w:r>
+      <w:r>
+        <w:rPr>
+          <w:rFonts w:ascii="Times New Roman" w:hAnsi="Times New Roman" w:cs="Times New Roman"/>
+          <w:sz w:val="28"/>
+          <w:szCs w:val="28"/>
+          <w:vertAlign w:val="subscript"/>
+        </w:rPr>
+        <w:t>б</w:t>
+      </w:r>
+      <w:r>
+        <w:rPr>
+          <w:rFonts w:ascii="Times New Roman" w:hAnsi="Times New Roman" w:cs="Times New Roman"/>
+          <w:sz w:val="28"/>
+          <w:szCs w:val="28"/>
+        </w:rPr>
+        <w:t xml:space="preserve"> = 50мкА и </w:t>
+      </w:r>
+      <w:proofErr w:type="spellStart"/>
+      <w:r>
+        <w:rPr>
+          <w:rFonts w:ascii="Times New Roman" w:hAnsi="Times New Roman" w:cs="Times New Roman"/>
+          <w:sz w:val="28"/>
+          <w:szCs w:val="28"/>
+        </w:rPr>
+        <w:t>I</w:t>
+      </w:r>
+      <w:r>
+        <w:rPr>
+          <w:rFonts w:ascii="Times New Roman" w:hAnsi="Times New Roman" w:cs="Times New Roman"/>
+          <w:sz w:val="28"/>
+          <w:szCs w:val="28"/>
+          <w:vertAlign w:val="subscript"/>
+        </w:rPr>
+        <w:t>б</w:t>
+      </w:r>
+      <w:proofErr w:type="spellEnd"/>
+      <w:r>
+        <w:rPr>
+          <w:rFonts w:ascii="Times New Roman" w:hAnsi="Times New Roman" w:cs="Times New Roman"/>
+          <w:sz w:val="28"/>
+          <w:szCs w:val="28"/>
+        </w:rPr>
+        <w:t xml:space="preserve"> = 500мкА:</w:t>
+      </w:r>
+    </w:p>
+    <w:p>
+      <w:pPr>
+        <w:spacing w:after="120" w:line="360" w:lineRule="auto"/>
+        <w:ind w:firstLine="357"/>
+        <w:jc w:val="both"/>
+        <w:rPr>
+          <w:rFonts w:ascii="Times New Roman" w:hAnsi="Times New Roman" w:cs="Times New Roman"/>
+          <w:sz w:val="28"/>
+          <w:szCs w:val="28"/>
+        </w:rPr>
+      </w:pPr>
+      <m:oMathPara>
+        <m:oMath>
+          <m:r>
+            <w:rPr>
+              <w:rFonts w:ascii="Cambria Math" w:hAnsi="Cambria Math" w:cs="Times New Roman"/>
+              <w:sz w:val="28"/>
+              <w:szCs w:val="28"/>
+            </w:rPr>
+            <m:t xml:space="preserve">β= </m:t>
+          </m:r>
+          <m:f>
+            <m:fPr>
+              <m:ctrlPr>
+                <w:rPr>
+                  <w:rFonts w:ascii="Cambria Math" w:eastAsiaTheme="minorEastAsia" w:hAnsi="Cambria Math" w:cs="Times New Roman"/>
+                  <w:i/>
+                  <w:sz w:val="28"/>
+                  <w:szCs w:val="28"/>
+                </w:rPr>
+              </m:ctrlPr>
+            </m:fPr>
+            <m:num>
+              <m:sSub>
+                <m:sSubPr>
+                  <m:ctrlPr>
+                    <w:rPr>
+                      <w:rFonts w:ascii="Cambria Math" w:eastAsiaTheme="minorEastAsia" w:hAnsi="Cambria Math" w:cs="Times New Roman"/>
+                      <w:i/>
+                      <w:sz w:val="28"/>
+                      <w:szCs w:val="28"/>
+                      <w:lang w:val="en-US"/>
+                    </w:rPr>
+                  </m:ctrlPr>
+                </m:sSubPr>
+                <m:e>
+                  <m:r>
+                    <w:rPr>
+                      <w:rFonts w:ascii="Cambria Math" w:eastAsiaTheme="minorEastAsia" w:hAnsi="Cambria Math" w:cs="Times New Roman"/>
+                      <w:sz w:val="28"/>
+                      <w:szCs w:val="28"/>
+                      <w:lang w:val="en-US"/>
+                    </w:rPr>
+                    <m:t>I</m:t>
+                  </m:r>
+                </m:e>
+                <m:sub>
+                  <m:r>
+                    <w:rPr>
+                      <w:rFonts w:ascii="Cambria Math" w:eastAsiaTheme="minorEastAsia" w:hAnsi="Cambria Math" w:cs="Times New Roman"/>
+                      <w:sz w:val="28"/>
+                      <w:szCs w:val="28"/>
+                      <w:lang w:val="en-US"/>
+                    </w:rPr>
+                    <m:t>к</m:t>
+                  </m:r>
+                </m:sub>
+              </m:sSub>
+            </m:num>
+            <m:den>
+              <m:sSub>
+                <m:sSubPr>
+                  <m:ctrlPr>
+                    <w:rPr>
+                      <w:rFonts w:ascii="Cambria Math" w:eastAsiaTheme="minorEastAsia" w:hAnsi="Cambria Math" w:cs="Times New Roman"/>
+                      <w:i/>
+                      <w:sz w:val="28"/>
+                      <w:szCs w:val="28"/>
+                    </w:rPr>
+                  </m:ctrlPr>
+                </m:sSubPr>
+                <m:e>
+                  <m:r>
+                    <w:rPr>
+                      <w:rFonts w:ascii="Cambria Math" w:eastAsiaTheme="minorEastAsia" w:hAnsi="Cambria Math" w:cs="Times New Roman"/>
+                      <w:sz w:val="28"/>
+                      <w:szCs w:val="28"/>
+                      <w:lang w:val="en-US"/>
+                    </w:rPr>
+                    <m:t>I</m:t>
+                  </m:r>
+                </m:e>
+                <m:sub>
+                  <m:r>
+                    <w:rPr>
+                      <w:rFonts w:ascii="Cambria Math" w:eastAsiaTheme="minorEastAsia" w:hAnsi="Cambria Math" w:cs="Times New Roman"/>
+                      <w:sz w:val="28"/>
+                      <w:szCs w:val="28"/>
+                    </w:rPr>
+                    <m:t>б</m:t>
+                  </m:r>
+                </m:sub>
+              </m:sSub>
+            </m:den>
+          </m:f>
+          <m:r>
+            <w:rPr>
+              <w:rFonts w:ascii="Cambria Math" w:eastAsiaTheme="minorEastAsia" w:hAnsi="Cambria Math" w:cs="Times New Roman"/>
+              <w:sz w:val="28"/>
+              <w:szCs w:val="28"/>
+            </w:rPr>
+            <m:t xml:space="preserve">= </m:t>
+          </m:r>
+          <m:f>
+            <m:fPr>
+              <m:ctrlPr>
+                <w:rPr>
+                  <w:rFonts w:ascii="Cambria Math" w:eastAsiaTheme="minorEastAsia" w:hAnsi="Cambria Math" w:cs="Times New Roman"/>
+                  <w:i/>
+                  <w:sz w:val="28"/>
+                  <w:szCs w:val="28"/>
+                </w:rPr>
+              </m:ctrlPr>
+            </m:fPr>
+            <m:num>
+              <m:r>
+                <w:rPr>
+                  <w:rFonts w:ascii="Cambria Math" w:eastAsiaTheme="minorEastAsia" w:hAnsi="Cambria Math" w:cs="Times New Roman"/>
+                  <w:sz w:val="28"/>
+                  <w:szCs w:val="28"/>
+                </w:rPr>
+                <m:t>75-7,5</m:t>
+              </m:r>
+            </m:num>
+            <m:den>
+              <m:r>
+                <w:rPr>
+                  <w:rFonts w:ascii="Cambria Math" w:eastAsiaTheme="minorEastAsia" w:hAnsi="Cambria Math" w:cs="Times New Roman"/>
+                  <w:sz w:val="28"/>
+                  <w:szCs w:val="28"/>
+                </w:rPr>
+                <m:t>500-50</m:t>
+              </m:r>
+            </m:den>
+          </m:f>
+          <m:r>
+            <w:rPr>
+              <w:rFonts w:ascii="Cambria Math" w:eastAsiaTheme="minorEastAsia" w:hAnsi="Cambria Math" w:cs="Times New Roman"/>
+              <w:sz w:val="28"/>
+              <w:szCs w:val="28"/>
+            </w:rPr>
+            <m:t xml:space="preserve">= </m:t>
+          </m:r>
+          <m:f>
+            <m:fPr>
+              <m:ctrlPr>
+                <w:rPr>
+                  <w:rFonts w:ascii="Cambria Math" w:eastAsiaTheme="minorEastAsia" w:hAnsi="Cambria Math" w:cs="Times New Roman"/>
+                  <w:i/>
+                  <w:sz w:val="28"/>
+                  <w:szCs w:val="28"/>
+                </w:rPr>
+              </m:ctrlPr>
+            </m:fPr>
+            <m:num>
+              <m:r>
+                <w:rPr>
+                  <w:rFonts w:ascii="Cambria Math" w:eastAsiaTheme="minorEastAsia" w:hAnsi="Cambria Math" w:cs="Times New Roman"/>
+                  <w:sz w:val="28"/>
+                  <w:szCs w:val="28"/>
+                </w:rPr>
+                <m:t>67,5</m:t>
+              </m:r>
+            </m:num>
+            <m:den>
+              <m:r>
+                <w:rPr>
+                  <w:rFonts w:ascii="Cambria Math" w:eastAsiaTheme="minorEastAsia" w:hAnsi="Cambria Math" w:cs="Times New Roman"/>
+                  <w:sz w:val="28"/>
+                  <w:szCs w:val="28"/>
+                </w:rPr>
+                <m:t>450</m:t>
+              </m:r>
+            </m:den>
+          </m:f>
+          <m:r>
+            <w:rPr>
+              <w:rFonts w:ascii="Cambria Math" w:eastAsiaTheme="minorEastAsia" w:hAnsi="Cambria Math" w:cs="Times New Roman"/>
+              <w:sz w:val="28"/>
+              <w:szCs w:val="28"/>
+            </w:rPr>
+            <m:t>=150</m:t>
+          </m:r>
+        </m:oMath>
+      </m:oMathPara>
+    </w:p>
+    <w:p>
+      <w:pPr>
+        <w:spacing w:after="120" w:line="360" w:lineRule="auto"/>
+        <w:ind w:firstLine="357"/>
+        <w:jc w:val="both"/>
         <w:rPr>
           <w:rFonts w:ascii="Times New Roman" w:hAnsi="Times New Roman" w:cs="Times New Roman"/>
           <w:sz w:val="24"/>
           <w:szCs w:val="24"/>
         </w:rPr>
-        <w:t xml:space="preserve">Рисунок 1 – Схема </w:t>
-      </w:r>
-      <w:r>
+      </w:pPr>
+      <w:r>
+        <w:rPr>
+          <w:rFonts w:ascii="Times New Roman" w:hAnsi="Times New Roman" w:cs="Times New Roman"/>
+          <w:sz w:val="28"/>
+          <w:szCs w:val="28"/>
+        </w:rPr>
+        <w:t xml:space="preserve">Можно заметить, что значение </w:t>
+      </w:r>
+      <m:oMath>
+        <m:r>
+          <w:rPr>
+            <w:rFonts w:ascii="Cambria Math" w:hAnsi="Cambria Math" w:cs="Times New Roman"/>
+            <w:sz w:val="28"/>
+            <w:szCs w:val="28"/>
+          </w:rPr>
+          <m:t>β</m:t>
+        </m:r>
+      </m:oMath>
+      <w:r>
+        <w:rPr>
+          <w:rFonts w:ascii="Times New Roman" w:eastAsiaTheme="minorEastAsia" w:hAnsi="Times New Roman" w:cs="Times New Roman"/>
+          <w:sz w:val="28"/>
+          <w:szCs w:val="28"/>
+        </w:rPr>
+        <w:t xml:space="preserve"> попадает в его диапазон значений </w:t>
+      </w:r>
+      <w:r>
+        <w:rPr>
+          <w:rFonts w:ascii="Times New Roman" w:eastAsiaTheme="minorEastAsia" w:hAnsi="Times New Roman" w:cs="Times New Roman"/>
+          <w:sz w:val="28"/>
+          <w:szCs w:val="28"/>
+        </w:rPr>
+        <w:t>[10; 1000].</w:t>
+      </w:r>
+    </w:p>
+    <w:p>
+      <w:pPr>
+        <w:jc w:val="center"/>
         <w:rPr>
           <w:rFonts w:ascii="Times New Roman" w:hAnsi="Times New Roman" w:cs="Times New Roman"/>
           <w:sz w:val="24"/>
-          <w:szCs w:val="24"/>
-        </w:rPr>
-        <w:t xml:space="preserve">измерения ВАХ биполярного </w:t>
-      </w:r>
+        </w:rPr>
+      </w:pPr>
       <w:r>
         <w:rPr>
           <w:rFonts w:ascii="Times New Roman" w:hAnsi="Times New Roman" w:cs="Times New Roman"/>
@@ -920,122 +1983,12 @@
           <w:szCs w:val="24"/>
           <w:lang w:val="en-US"/>
         </w:rPr>
-        <w:t>n</w:t>
-      </w:r>
-      <w:r>
-        <w:rPr>
-          <w:rFonts w:ascii="Times New Roman" w:hAnsi="Times New Roman" w:cs="Times New Roman"/>
-          <w:sz w:val="24"/>
-          <w:szCs w:val="24"/>
-        </w:rPr>
-        <w:t>-</w:t>
-      </w:r>
-      <w:r>
-        <w:rPr>
-          <w:rFonts w:ascii="Times New Roman" w:hAnsi="Times New Roman" w:cs="Times New Roman"/>
-          <w:sz w:val="24"/>
-          <w:szCs w:val="24"/>
-          <w:lang w:val="en-US"/>
-        </w:rPr>
-        <w:t>p</w:t>
-      </w:r>
-      <w:r>
-        <w:rPr>
-          <w:rFonts w:ascii="Times New Roman" w:hAnsi="Times New Roman" w:cs="Times New Roman"/>
-          <w:sz w:val="24"/>
-          <w:szCs w:val="24"/>
-        </w:rPr>
-        <w:t>-</w:t>
-      </w:r>
-      <w:r>
-        <w:rPr>
-          <w:rFonts w:ascii="Times New Roman" w:hAnsi="Times New Roman" w:cs="Times New Roman"/>
-          <w:sz w:val="24"/>
-          <w:szCs w:val="24"/>
-          <w:lang w:val="en-US"/>
-        </w:rPr>
-        <w:t>n</w:t>
-      </w:r>
-      <w:r>
-        <w:rPr>
-          <w:rFonts w:ascii="Times New Roman" w:hAnsi="Times New Roman" w:cs="Times New Roman"/>
-          <w:sz w:val="24"/>
-          <w:szCs w:val="24"/>
-        </w:rPr>
-        <w:t xml:space="preserve"> </w:t>
-      </w:r>
-      <w:r>
-        <w:rPr>
-          <w:rFonts w:ascii="Times New Roman" w:hAnsi="Times New Roman" w:cs="Times New Roman"/>
-          <w:sz w:val="24"/>
-          <w:szCs w:val="24"/>
-        </w:rPr>
-        <w:t>транзистора</w:t>
-      </w:r>
-      <w:r>
-        <w:rPr>
-          <w:rFonts w:ascii="Times New Roman" w:hAnsi="Times New Roman" w:cs="Times New Roman"/>
-          <w:sz w:val="24"/>
-          <w:szCs w:val="24"/>
-        </w:rPr>
-        <w:t xml:space="preserve"> согласно варианту №4</w:t>
-      </w:r>
-    </w:p>
-    <w:p>
-      <w:pPr>
-        <w:spacing w:after="120" w:line="360" w:lineRule="auto"/>
-        <w:ind w:firstLine="357"/>
-        <w:jc w:val="both"/>
-        <w:rPr>
-          <w:rFonts w:ascii="Times New Roman" w:hAnsi="Times New Roman" w:cs="Times New Roman"/>
-          <w:sz w:val="28"/>
-          <w:szCs w:val="28"/>
-        </w:rPr>
-      </w:pPr>
-      <w:r>
-        <w:rPr>
-          <w:rFonts w:ascii="Times New Roman" w:hAnsi="Times New Roman" w:cs="Times New Roman"/>
-          <w:sz w:val="28"/>
-          <w:szCs w:val="28"/>
-        </w:rPr>
         <w:lastRenderedPageBreak/>
-        <w:t xml:space="preserve">Пункты 2, 3 </w:t>
-      </w:r>
-      <w:proofErr w:type="gramStart"/>
-      <w:r>
-        <w:rPr>
-          <w:rFonts w:ascii="Times New Roman" w:hAnsi="Times New Roman" w:cs="Times New Roman"/>
-          <w:sz w:val="28"/>
-          <w:szCs w:val="28"/>
-        </w:rPr>
-        <w:t>– ?</w:t>
-      </w:r>
-      <w:proofErr w:type="gramEnd"/>
-    </w:p>
-    <w:p>
-      <w:pPr>
-        <w:spacing w:line="360" w:lineRule="auto"/>
-        <w:ind w:firstLine="709"/>
-        <w:jc w:val="center"/>
-        <w:rPr>
-          <w:rFonts w:ascii="Times New Roman" w:hAnsi="Times New Roman" w:cs="Times New Roman"/>
-          <w:sz w:val="24"/>
-          <w:szCs w:val="24"/>
-        </w:rPr>
-      </w:pPr>
-      <w:r>
-        <w:rPr>
-          <w:rFonts w:ascii="Times New Roman" w:hAnsi="Times New Roman" w:cs="Times New Roman"/>
-          <w:noProof/>
-          <w:sz w:val="28"/>
-          <w:szCs w:val="28"/>
-          <w:lang w:eastAsia="ru-RU"/>
-        </w:rPr>
         <w:drawing>
-          <wp:inline distT="0" distB="0" distL="0" distR="0" wp14:anchorId="4D3FBC8A" wp14:editId="7985993D">
-            <wp:extent cx="5490944" cy="2636874"/>
+          <wp:inline distT="0" distB="0" distL="0" distR="0" wp14:anchorId="795EDE87" wp14:editId="5BACB8E1">
+            <wp:extent cx="5397297" cy="3721100"/>
             <wp:effectExtent l="0" t="0" r="0" b="0"/>
-            <wp:docPr id="1673936582" name="Рисунок 1"/>
+            <wp:docPr id="2" name="Рисунок 2"/>
             <wp:cNvGraphicFramePr>
               <a:graphicFrameLocks xmlns:a="http://schemas.openxmlformats.org/drawingml/2006/main" noChangeAspect="1"/>
             </wp:cNvGraphicFramePr>
@@ -1043,79 +1996,7 @@
               <a:graphicData uri="http://schemas.openxmlformats.org/drawingml/2006/picture">
                 <pic:pic xmlns:pic="http://schemas.openxmlformats.org/drawingml/2006/picture">
                   <pic:nvPicPr>
-                    <pic:cNvPr id="1673936582" name=""/>
-                    <pic:cNvPicPr/>
-                  </pic:nvPicPr>
-                  <pic:blipFill>
-                    <a:blip r:embed="rId6"/>
-                    <a:stretch>
-                      <a:fillRect/>
-                    </a:stretch>
-                  </pic:blipFill>
-                  <pic:spPr>
-                    <a:xfrm>
-                      <a:off x="0" y="0"/>
-                      <a:ext cx="5507736" cy="2644938"/>
-                    </a:xfrm>
-                    <a:prstGeom prst="rect">
-                      <a:avLst/>
-                    </a:prstGeom>
-                  </pic:spPr>
-                </pic:pic>
-              </a:graphicData>
-            </a:graphic>
-          </wp:inline>
-        </w:drawing>
-      </w:r>
-      <w:r>
-        <w:rPr>
-          <w:rFonts w:ascii="Times New Roman" w:hAnsi="Times New Roman" w:cs="Times New Roman"/>
-          <w:sz w:val="28"/>
-          <w:szCs w:val="28"/>
-        </w:rPr>
-        <w:br/>
-      </w:r>
-      <w:r>
-        <w:rPr>
-          <w:rFonts w:ascii="Times New Roman" w:hAnsi="Times New Roman" w:cs="Times New Roman"/>
-          <w:sz w:val="24"/>
-          <w:szCs w:val="24"/>
-        </w:rPr>
-        <w:t>Рисунок 2 – Интегрирующая цепочка</w:t>
-      </w:r>
-    </w:p>
-    <w:p>
-      <w:pPr>
-        <w:spacing w:line="360" w:lineRule="auto"/>
-        <w:ind w:firstLine="709"/>
-        <w:jc w:val="center"/>
-        <w:rPr>
-          <w:rFonts w:ascii="Times New Roman" w:hAnsi="Times New Roman" w:cs="Times New Roman"/>
-          <w:sz w:val="24"/>
-          <w:szCs w:val="24"/>
-        </w:rPr>
-      </w:pPr>
-      <w:r>
-        <w:rPr>
-          <w:rFonts w:ascii="Times New Roman" w:hAnsi="Times New Roman" w:cs="Times New Roman"/>
-          <w:noProof/>
-          <w:sz w:val="24"/>
-          <w:szCs w:val="24"/>
-          <w:lang w:eastAsia="ru-RU"/>
-        </w:rPr>
-        <w:drawing>
-          <wp:inline distT="0" distB="0" distL="0" distR="0" wp14:anchorId="61098F08" wp14:editId="1CE17ABD">
-            <wp:extent cx="4710224" cy="3038935"/>
-            <wp:effectExtent l="0" t="0" r="0" b="9525"/>
-            <wp:docPr id="611663002" name="Рисунок 1"/>
-            <wp:cNvGraphicFramePr>
-              <a:graphicFrameLocks xmlns:a="http://schemas.openxmlformats.org/drawingml/2006/main" noChangeAspect="1"/>
-            </wp:cNvGraphicFramePr>
-            <a:graphic xmlns:a="http://schemas.openxmlformats.org/drawingml/2006/main">
-              <a:graphicData uri="http://schemas.openxmlformats.org/drawingml/2006/picture">
-                <pic:pic xmlns:pic="http://schemas.openxmlformats.org/drawingml/2006/picture">
-                  <pic:nvPicPr>
-                    <pic:cNvPr id="611663002" name=""/>
+                    <pic:cNvPr id="1" name=""/>
                     <pic:cNvPicPr/>
                   </pic:nvPicPr>
                   <pic:blipFill>
@@ -1127,7 +2008,7 @@
                   <pic:spPr>
                     <a:xfrm>
                       <a:off x="0" y="0"/>
-                      <a:ext cx="4719206" cy="3044730"/>
+                      <a:ext cx="5432875" cy="3745629"/>
                     </a:xfrm>
                     <a:prstGeom prst="rect">
                       <a:avLst/>
@@ -1146,34 +2027,664 @@
           <w:szCs w:val="24"/>
         </w:rPr>
         <w:br/>
-        <w:t>Рисунок 3 – Значения осциллографа</w:t>
+      </w:r>
+      <w:r>
+        <w:rPr>
+          <w:rFonts w:ascii="Times New Roman" w:hAnsi="Times New Roman" w:cs="Times New Roman"/>
+          <w:sz w:val="24"/>
+        </w:rPr>
+        <w:t xml:space="preserve">Рисунок 2 — Схема транзитного ключа на </w:t>
+      </w:r>
+      <w:r>
+        <w:rPr>
+          <w:rFonts w:ascii="Times New Roman" w:hAnsi="Times New Roman" w:cs="Times New Roman"/>
+          <w:sz w:val="24"/>
+          <w:lang w:val="en-US"/>
+        </w:rPr>
+        <w:t>n</w:t>
+      </w:r>
+      <w:r>
+        <w:rPr>
+          <w:rFonts w:ascii="Times New Roman" w:hAnsi="Times New Roman" w:cs="Times New Roman"/>
+          <w:sz w:val="24"/>
+        </w:rPr>
+        <w:t>-</w:t>
+      </w:r>
+      <w:r>
+        <w:rPr>
+          <w:rFonts w:ascii="Times New Roman" w:hAnsi="Times New Roman" w:cs="Times New Roman"/>
+          <w:sz w:val="24"/>
+          <w:lang w:val="en-US"/>
+        </w:rPr>
+        <w:t>p</w:t>
+      </w:r>
+      <w:r>
+        <w:rPr>
+          <w:rFonts w:ascii="Times New Roman" w:hAnsi="Times New Roman" w:cs="Times New Roman"/>
+          <w:sz w:val="24"/>
+        </w:rPr>
+        <w:t>-</w:t>
+      </w:r>
+      <w:r>
+        <w:rPr>
+          <w:rFonts w:ascii="Times New Roman" w:hAnsi="Times New Roman" w:cs="Times New Roman"/>
+          <w:sz w:val="24"/>
+          <w:lang w:val="en-US"/>
+        </w:rPr>
+        <w:t>n</w:t>
+      </w:r>
+      <w:r>
+        <w:rPr>
+          <w:rFonts w:ascii="Times New Roman" w:hAnsi="Times New Roman" w:cs="Times New Roman"/>
+          <w:sz w:val="24"/>
+        </w:rPr>
+        <w:t xml:space="preserve"> </w:t>
+      </w:r>
+      <w:r>
+        <w:rPr>
+          <w:rFonts w:ascii="Times New Roman" w:hAnsi="Times New Roman" w:cs="Times New Roman"/>
+          <w:sz w:val="24"/>
+        </w:rPr>
+        <w:t>транзисторе</w:t>
       </w:r>
     </w:p>
     <w:p>
       <w:pPr>
         <w:spacing w:line="360" w:lineRule="auto"/>
-        <w:ind w:firstLine="709"/>
-        <w:jc w:val="center"/>
         <w:rPr>
           <w:rFonts w:ascii="Times New Roman" w:hAnsi="Times New Roman" w:cs="Times New Roman"/>
           <w:sz w:val="24"/>
           <w:szCs w:val="24"/>
         </w:rPr>
       </w:pPr>
-      <w:r>
-        <w:rPr>
-          <w:rFonts w:ascii="Times New Roman" w:hAnsi="Times New Roman" w:cs="Times New Roman"/>
-          <w:noProof/>
+    </w:p>
+    <w:tbl>
+      <w:tblPr>
+        <w:tblStyle w:val="ac"/>
+        <w:tblW w:w="0" w:type="auto"/>
+        <w:tblLook w:val="04A0" w:firstRow="1" w:lastRow="0" w:firstColumn="1" w:lastColumn="0" w:noHBand="0" w:noVBand="1"/>
+      </w:tblPr>
+      <w:tblGrid>
+        <w:gridCol w:w="3114"/>
+        <w:gridCol w:w="3115"/>
+        <w:gridCol w:w="3115"/>
+      </w:tblGrid>
+      <w:tr>
+        <w:tc>
+          <w:tcPr>
+            <w:tcW w:w="3115" w:type="dxa"/>
+            <w:tcBorders>
+              <w:top w:val="single" w:sz="4" w:space="0" w:color="auto"/>
+              <w:left w:val="single" w:sz="4" w:space="0" w:color="auto"/>
+              <w:bottom w:val="single" w:sz="4" w:space="0" w:color="auto"/>
+              <w:right w:val="single" w:sz="4" w:space="0" w:color="auto"/>
+            </w:tcBorders>
+            <w:hideMark/>
+          </w:tcPr>
+          <w:p>
+            <w:pPr>
+              <w:tabs>
+                <w:tab w:val="center" w:pos="4677"/>
+                <w:tab w:val="left" w:pos="7873"/>
+              </w:tabs>
+              <w:jc w:val="center"/>
+              <w:rPr>
+                <w:rFonts w:ascii="Times New Roman" w:hAnsi="Times New Roman" w:cs="Times New Roman"/>
+                <w:sz w:val="28"/>
+                <w:szCs w:val="28"/>
+                <w:lang w:val="en-US" w:eastAsia="ru-RU"/>
+              </w:rPr>
+            </w:pPr>
+            <w:r>
+              <w:rPr>
+                <w:rFonts w:ascii="Times New Roman" w:hAnsi="Times New Roman" w:cs="Times New Roman"/>
+                <w:sz w:val="28"/>
+                <w:szCs w:val="28"/>
+                <w:lang w:eastAsia="ru-RU"/>
+              </w:rPr>
+              <w:t>Частота</w:t>
+            </w:r>
+            <w:r>
+              <w:rPr>
+                <w:rFonts w:ascii="Times New Roman" w:hAnsi="Times New Roman" w:cs="Times New Roman"/>
+                <w:sz w:val="28"/>
+                <w:szCs w:val="28"/>
+                <w:lang w:val="en-US" w:eastAsia="ru-RU"/>
+              </w:rPr>
+              <w:t>,</w:t>
+            </w:r>
+            <w:r>
+              <w:rPr>
+                <w:rFonts w:ascii="Times New Roman" w:hAnsi="Times New Roman" w:cs="Times New Roman"/>
+                <w:sz w:val="28"/>
+                <w:szCs w:val="28"/>
+                <w:lang w:val="en-US" w:eastAsia="ru-RU"/>
+              </w:rPr>
+              <w:t xml:space="preserve"> </w:t>
+            </w:r>
+            <w:r>
+              <w:rPr>
+                <w:rFonts w:ascii="Times New Roman" w:hAnsi="Times New Roman" w:cs="Times New Roman"/>
+                <w:sz w:val="28"/>
+                <w:szCs w:val="28"/>
+                <w:lang w:eastAsia="ru-RU"/>
+              </w:rPr>
+              <w:t>кГц</w:t>
+            </w:r>
+          </w:p>
+        </w:tc>
+        <w:tc>
+          <w:tcPr>
+            <w:tcW w:w="3115" w:type="dxa"/>
+            <w:tcBorders>
+              <w:top w:val="single" w:sz="4" w:space="0" w:color="auto"/>
+              <w:left w:val="single" w:sz="4" w:space="0" w:color="auto"/>
+              <w:bottom w:val="single" w:sz="4" w:space="0" w:color="auto"/>
+              <w:right w:val="single" w:sz="4" w:space="0" w:color="auto"/>
+            </w:tcBorders>
+            <w:hideMark/>
+          </w:tcPr>
+          <w:p>
+            <w:pPr>
+              <w:tabs>
+                <w:tab w:val="center" w:pos="4677"/>
+                <w:tab w:val="left" w:pos="7873"/>
+              </w:tabs>
+              <w:jc w:val="center"/>
+              <w:rPr>
+                <w:rFonts w:ascii="Times New Roman" w:hAnsi="Times New Roman" w:cs="Times New Roman"/>
+                <w:sz w:val="28"/>
+                <w:szCs w:val="28"/>
+                <w:lang w:eastAsia="ru-RU"/>
+              </w:rPr>
+            </w:pPr>
+            <w:r>
+              <w:rPr>
+                <w:rFonts w:ascii="Times New Roman" w:hAnsi="Times New Roman" w:cs="Times New Roman"/>
+                <w:sz w:val="28"/>
+                <w:szCs w:val="28"/>
+                <w:lang w:val="en-US" w:eastAsia="ru-RU"/>
+              </w:rPr>
+              <w:t>t</w:t>
+            </w:r>
+            <w:r>
+              <w:rPr>
+                <w:rFonts w:ascii="Times New Roman" w:hAnsi="Times New Roman" w:cs="Times New Roman"/>
+                <w:sz w:val="28"/>
+                <w:szCs w:val="28"/>
+                <w:vertAlign w:val="subscript"/>
+                <w:lang w:val="en-US" w:eastAsia="ru-RU"/>
+              </w:rPr>
+              <w:t>1</w:t>
+            </w:r>
+            <w:r>
+              <w:rPr>
+                <w:rFonts w:ascii="Times New Roman" w:hAnsi="Times New Roman" w:cs="Times New Roman"/>
+                <w:sz w:val="28"/>
+                <w:szCs w:val="28"/>
+                <w:lang w:val="en-US" w:eastAsia="ru-RU"/>
+              </w:rPr>
+              <w:t>,</w:t>
+            </w:r>
+            <w:r>
+              <w:rPr>
+                <w:rFonts w:ascii="Times New Roman" w:hAnsi="Times New Roman" w:cs="Times New Roman"/>
+                <w:sz w:val="28"/>
+                <w:szCs w:val="28"/>
+                <w:lang w:eastAsia="ru-RU"/>
+              </w:rPr>
+              <w:t xml:space="preserve"> </w:t>
+            </w:r>
+            <w:proofErr w:type="spellStart"/>
+            <w:r>
+              <w:rPr>
+                <w:rFonts w:ascii="Times New Roman" w:hAnsi="Times New Roman" w:cs="Times New Roman"/>
+                <w:sz w:val="28"/>
+                <w:szCs w:val="28"/>
+                <w:lang w:eastAsia="ru-RU"/>
+              </w:rPr>
+              <w:t>мкс</w:t>
+            </w:r>
+            <w:proofErr w:type="spellEnd"/>
+          </w:p>
+        </w:tc>
+        <w:tc>
+          <w:tcPr>
+            <w:tcW w:w="3115" w:type="dxa"/>
+            <w:tcBorders>
+              <w:top w:val="single" w:sz="4" w:space="0" w:color="auto"/>
+              <w:left w:val="single" w:sz="4" w:space="0" w:color="auto"/>
+              <w:bottom w:val="single" w:sz="4" w:space="0" w:color="auto"/>
+              <w:right w:val="single" w:sz="4" w:space="0" w:color="auto"/>
+            </w:tcBorders>
+            <w:hideMark/>
+          </w:tcPr>
+          <w:p>
+            <w:pPr>
+              <w:tabs>
+                <w:tab w:val="center" w:pos="4677"/>
+                <w:tab w:val="left" w:pos="7873"/>
+              </w:tabs>
+              <w:jc w:val="center"/>
+              <w:rPr>
+                <w:rFonts w:ascii="Times New Roman" w:hAnsi="Times New Roman" w:cs="Times New Roman"/>
+                <w:sz w:val="28"/>
+                <w:szCs w:val="28"/>
+                <w:lang w:eastAsia="ru-RU"/>
+              </w:rPr>
+            </w:pPr>
+            <w:r>
+              <w:rPr>
+                <w:rFonts w:ascii="Times New Roman" w:hAnsi="Times New Roman" w:cs="Times New Roman"/>
+                <w:sz w:val="28"/>
+                <w:szCs w:val="28"/>
+                <w:lang w:val="en-US" w:eastAsia="ru-RU"/>
+              </w:rPr>
+              <w:t>t</w:t>
+            </w:r>
+            <w:r>
+              <w:rPr>
+                <w:rFonts w:ascii="Times New Roman" w:hAnsi="Times New Roman" w:cs="Times New Roman"/>
+                <w:sz w:val="28"/>
+                <w:szCs w:val="28"/>
+                <w:vertAlign w:val="subscript"/>
+                <w:lang w:val="en-US" w:eastAsia="ru-RU"/>
+              </w:rPr>
+              <w:t>2</w:t>
+            </w:r>
+            <w:r>
+              <w:rPr>
+                <w:rFonts w:ascii="Times New Roman" w:hAnsi="Times New Roman" w:cs="Times New Roman"/>
+                <w:sz w:val="28"/>
+                <w:szCs w:val="28"/>
+                <w:lang w:val="en-US" w:eastAsia="ru-RU"/>
+              </w:rPr>
+              <w:t>,</w:t>
+            </w:r>
+            <w:r>
+              <w:rPr>
+                <w:rFonts w:ascii="Times New Roman" w:hAnsi="Times New Roman" w:cs="Times New Roman"/>
+                <w:sz w:val="28"/>
+                <w:szCs w:val="28"/>
+                <w:lang w:eastAsia="ru-RU"/>
+              </w:rPr>
+              <w:t xml:space="preserve"> </w:t>
+            </w:r>
+            <w:proofErr w:type="spellStart"/>
+            <w:r>
+              <w:rPr>
+                <w:rFonts w:ascii="Times New Roman" w:hAnsi="Times New Roman" w:cs="Times New Roman"/>
+                <w:sz w:val="28"/>
+                <w:szCs w:val="28"/>
+                <w:lang w:eastAsia="ru-RU"/>
+              </w:rPr>
+              <w:t>мкс</w:t>
+            </w:r>
+            <w:proofErr w:type="spellEnd"/>
+          </w:p>
+        </w:tc>
+      </w:tr>
+      <w:tr>
+        <w:tc>
+          <w:tcPr>
+            <w:tcW w:w="3115" w:type="dxa"/>
+            <w:tcBorders>
+              <w:top w:val="single" w:sz="4" w:space="0" w:color="auto"/>
+              <w:left w:val="single" w:sz="4" w:space="0" w:color="auto"/>
+              <w:bottom w:val="single" w:sz="4" w:space="0" w:color="auto"/>
+              <w:right w:val="single" w:sz="4" w:space="0" w:color="auto"/>
+            </w:tcBorders>
+            <w:hideMark/>
+          </w:tcPr>
+          <w:p>
+            <w:pPr>
+              <w:tabs>
+                <w:tab w:val="center" w:pos="4677"/>
+                <w:tab w:val="left" w:pos="7873"/>
+              </w:tabs>
+              <w:jc w:val="center"/>
+              <w:rPr>
+                <w:rFonts w:ascii="Times New Roman" w:hAnsi="Times New Roman" w:cs="Times New Roman"/>
+                <w:sz w:val="28"/>
+                <w:szCs w:val="28"/>
+                <w:lang w:eastAsia="ru-RU"/>
+              </w:rPr>
+            </w:pPr>
+            <w:r>
+              <w:rPr>
+                <w:rFonts w:ascii="Times New Roman" w:hAnsi="Times New Roman" w:cs="Times New Roman"/>
+                <w:sz w:val="28"/>
+                <w:szCs w:val="28"/>
+                <w:lang w:eastAsia="ru-RU"/>
+              </w:rPr>
+              <w:t>10</w:t>
+            </w:r>
+          </w:p>
+        </w:tc>
+        <w:tc>
+          <w:tcPr>
+            <w:tcW w:w="3115" w:type="dxa"/>
+            <w:tcBorders>
+              <w:top w:val="single" w:sz="4" w:space="0" w:color="auto"/>
+              <w:left w:val="single" w:sz="4" w:space="0" w:color="auto"/>
+              <w:bottom w:val="single" w:sz="4" w:space="0" w:color="auto"/>
+              <w:right w:val="single" w:sz="4" w:space="0" w:color="auto"/>
+            </w:tcBorders>
+            <w:hideMark/>
+          </w:tcPr>
+          <w:p>
+            <w:pPr>
+              <w:tabs>
+                <w:tab w:val="center" w:pos="4677"/>
+                <w:tab w:val="left" w:pos="7873"/>
+              </w:tabs>
+              <w:jc w:val="center"/>
+              <w:rPr>
+                <w:rFonts w:ascii="Times New Roman" w:hAnsi="Times New Roman" w:cs="Times New Roman"/>
+                <w:sz w:val="28"/>
+                <w:szCs w:val="28"/>
+                <w:lang w:eastAsia="ru-RU"/>
+              </w:rPr>
+            </w:pPr>
+            <w:r>
+              <w:rPr>
+                <w:rFonts w:ascii="Times New Roman" w:hAnsi="Times New Roman" w:cs="Times New Roman"/>
+                <w:sz w:val="28"/>
+                <w:szCs w:val="28"/>
+                <w:lang w:eastAsia="ru-RU"/>
+              </w:rPr>
+              <w:t>0,36</w:t>
+            </w:r>
+          </w:p>
+        </w:tc>
+        <w:tc>
+          <w:tcPr>
+            <w:tcW w:w="3115" w:type="dxa"/>
+            <w:tcBorders>
+              <w:top w:val="single" w:sz="4" w:space="0" w:color="auto"/>
+              <w:left w:val="single" w:sz="4" w:space="0" w:color="auto"/>
+              <w:bottom w:val="single" w:sz="4" w:space="0" w:color="auto"/>
+              <w:right w:val="single" w:sz="4" w:space="0" w:color="auto"/>
+            </w:tcBorders>
+            <w:hideMark/>
+          </w:tcPr>
+          <w:p>
+            <w:pPr>
+              <w:tabs>
+                <w:tab w:val="center" w:pos="4677"/>
+                <w:tab w:val="left" w:pos="7873"/>
+              </w:tabs>
+              <w:jc w:val="center"/>
+              <w:rPr>
+                <w:rFonts w:ascii="Times New Roman" w:hAnsi="Times New Roman" w:cs="Times New Roman"/>
+                <w:sz w:val="28"/>
+                <w:szCs w:val="28"/>
+                <w:lang w:eastAsia="ru-RU"/>
+              </w:rPr>
+            </w:pPr>
+            <w:r>
+              <w:rPr>
+                <w:rFonts w:ascii="Times New Roman" w:hAnsi="Times New Roman" w:cs="Times New Roman"/>
+                <w:sz w:val="28"/>
+                <w:szCs w:val="28"/>
+                <w:lang w:eastAsia="ru-RU"/>
+              </w:rPr>
+              <w:t>0,6</w:t>
+            </w:r>
+          </w:p>
+        </w:tc>
+      </w:tr>
+      <w:tr>
+        <w:tc>
+          <w:tcPr>
+            <w:tcW w:w="3115" w:type="dxa"/>
+            <w:tcBorders>
+              <w:top w:val="single" w:sz="4" w:space="0" w:color="auto"/>
+              <w:left w:val="single" w:sz="4" w:space="0" w:color="auto"/>
+              <w:bottom w:val="single" w:sz="4" w:space="0" w:color="auto"/>
+              <w:right w:val="single" w:sz="4" w:space="0" w:color="auto"/>
+            </w:tcBorders>
+            <w:hideMark/>
+          </w:tcPr>
+          <w:p>
+            <w:pPr>
+              <w:tabs>
+                <w:tab w:val="center" w:pos="4677"/>
+                <w:tab w:val="left" w:pos="7873"/>
+              </w:tabs>
+              <w:jc w:val="center"/>
+              <w:rPr>
+                <w:rFonts w:ascii="Times New Roman" w:hAnsi="Times New Roman" w:cs="Times New Roman"/>
+                <w:sz w:val="28"/>
+                <w:szCs w:val="28"/>
+                <w:lang w:eastAsia="ru-RU"/>
+              </w:rPr>
+            </w:pPr>
+            <w:r>
+              <w:rPr>
+                <w:rFonts w:ascii="Times New Roman" w:hAnsi="Times New Roman" w:cs="Times New Roman"/>
+                <w:sz w:val="28"/>
+                <w:szCs w:val="28"/>
+                <w:lang w:eastAsia="ru-RU"/>
+              </w:rPr>
+              <w:t>50</w:t>
+            </w:r>
+          </w:p>
+        </w:tc>
+        <w:tc>
+          <w:tcPr>
+            <w:tcW w:w="3115" w:type="dxa"/>
+            <w:tcBorders>
+              <w:top w:val="single" w:sz="4" w:space="0" w:color="auto"/>
+              <w:left w:val="single" w:sz="4" w:space="0" w:color="auto"/>
+              <w:bottom w:val="single" w:sz="4" w:space="0" w:color="auto"/>
+              <w:right w:val="single" w:sz="4" w:space="0" w:color="auto"/>
+            </w:tcBorders>
+            <w:hideMark/>
+          </w:tcPr>
+          <w:p>
+            <w:pPr>
+              <w:tabs>
+                <w:tab w:val="center" w:pos="4677"/>
+                <w:tab w:val="left" w:pos="7873"/>
+              </w:tabs>
+              <w:jc w:val="center"/>
+              <w:rPr>
+                <w:rFonts w:ascii="Times New Roman" w:hAnsi="Times New Roman" w:cs="Times New Roman"/>
+                <w:sz w:val="28"/>
+                <w:szCs w:val="28"/>
+                <w:lang w:eastAsia="ru-RU"/>
+              </w:rPr>
+            </w:pPr>
+            <w:r>
+              <w:rPr>
+                <w:rFonts w:ascii="Times New Roman" w:hAnsi="Times New Roman" w:cs="Times New Roman"/>
+                <w:sz w:val="28"/>
+                <w:szCs w:val="28"/>
+                <w:lang w:eastAsia="ru-RU"/>
+              </w:rPr>
+              <w:t>0,37</w:t>
+            </w:r>
+          </w:p>
+        </w:tc>
+        <w:tc>
+          <w:tcPr>
+            <w:tcW w:w="3115" w:type="dxa"/>
+            <w:tcBorders>
+              <w:top w:val="single" w:sz="4" w:space="0" w:color="auto"/>
+              <w:left w:val="single" w:sz="4" w:space="0" w:color="auto"/>
+              <w:bottom w:val="single" w:sz="4" w:space="0" w:color="auto"/>
+              <w:right w:val="single" w:sz="4" w:space="0" w:color="auto"/>
+            </w:tcBorders>
+            <w:hideMark/>
+          </w:tcPr>
+          <w:p>
+            <w:pPr>
+              <w:tabs>
+                <w:tab w:val="center" w:pos="4677"/>
+                <w:tab w:val="left" w:pos="7873"/>
+              </w:tabs>
+              <w:jc w:val="center"/>
+              <w:rPr>
+                <w:rFonts w:ascii="Times New Roman" w:hAnsi="Times New Roman" w:cs="Times New Roman"/>
+                <w:sz w:val="28"/>
+                <w:szCs w:val="28"/>
+                <w:lang w:eastAsia="ru-RU"/>
+              </w:rPr>
+            </w:pPr>
+            <w:r>
+              <w:rPr>
+                <w:rFonts w:ascii="Times New Roman" w:hAnsi="Times New Roman" w:cs="Times New Roman"/>
+                <w:sz w:val="28"/>
+                <w:szCs w:val="28"/>
+                <w:lang w:eastAsia="ru-RU"/>
+              </w:rPr>
+              <w:t>0,6</w:t>
+            </w:r>
+          </w:p>
+        </w:tc>
+      </w:tr>
+      <w:tr>
+        <w:tc>
+          <w:tcPr>
+            <w:tcW w:w="3115" w:type="dxa"/>
+            <w:tcBorders>
+              <w:top w:val="single" w:sz="4" w:space="0" w:color="auto"/>
+              <w:left w:val="single" w:sz="4" w:space="0" w:color="auto"/>
+              <w:bottom w:val="single" w:sz="4" w:space="0" w:color="auto"/>
+              <w:right w:val="single" w:sz="4" w:space="0" w:color="auto"/>
+            </w:tcBorders>
+            <w:hideMark/>
+          </w:tcPr>
+          <w:p>
+            <w:pPr>
+              <w:tabs>
+                <w:tab w:val="center" w:pos="4677"/>
+                <w:tab w:val="left" w:pos="7873"/>
+              </w:tabs>
+              <w:jc w:val="center"/>
+              <w:rPr>
+                <w:rFonts w:ascii="Times New Roman" w:hAnsi="Times New Roman" w:cs="Times New Roman"/>
+                <w:sz w:val="28"/>
+                <w:szCs w:val="28"/>
+                <w:lang w:eastAsia="ru-RU"/>
+              </w:rPr>
+            </w:pPr>
+            <w:r>
+              <w:rPr>
+                <w:rFonts w:ascii="Times New Roman" w:hAnsi="Times New Roman" w:cs="Times New Roman"/>
+                <w:sz w:val="28"/>
+                <w:szCs w:val="28"/>
+                <w:lang w:eastAsia="ru-RU"/>
+              </w:rPr>
+              <w:t>100</w:t>
+            </w:r>
+          </w:p>
+        </w:tc>
+        <w:tc>
+          <w:tcPr>
+            <w:tcW w:w="3115" w:type="dxa"/>
+            <w:tcBorders>
+              <w:top w:val="single" w:sz="4" w:space="0" w:color="auto"/>
+              <w:left w:val="single" w:sz="4" w:space="0" w:color="auto"/>
+              <w:bottom w:val="single" w:sz="4" w:space="0" w:color="auto"/>
+              <w:right w:val="single" w:sz="4" w:space="0" w:color="auto"/>
+            </w:tcBorders>
+            <w:hideMark/>
+          </w:tcPr>
+          <w:p>
+            <w:pPr>
+              <w:tabs>
+                <w:tab w:val="center" w:pos="4677"/>
+                <w:tab w:val="left" w:pos="7873"/>
+              </w:tabs>
+              <w:jc w:val="center"/>
+              <w:rPr>
+                <w:rFonts w:ascii="Times New Roman" w:hAnsi="Times New Roman" w:cs="Times New Roman"/>
+                <w:sz w:val="28"/>
+                <w:szCs w:val="28"/>
+                <w:lang w:eastAsia="ru-RU"/>
+              </w:rPr>
+            </w:pPr>
+            <w:r>
+              <w:rPr>
+                <w:rFonts w:ascii="Times New Roman" w:hAnsi="Times New Roman" w:cs="Times New Roman"/>
+                <w:sz w:val="28"/>
+                <w:szCs w:val="28"/>
+                <w:lang w:eastAsia="ru-RU"/>
+              </w:rPr>
+              <w:t>0,36</w:t>
+            </w:r>
+          </w:p>
+        </w:tc>
+        <w:tc>
+          <w:tcPr>
+            <w:tcW w:w="3115" w:type="dxa"/>
+            <w:tcBorders>
+              <w:top w:val="single" w:sz="4" w:space="0" w:color="auto"/>
+              <w:left w:val="single" w:sz="4" w:space="0" w:color="auto"/>
+              <w:bottom w:val="single" w:sz="4" w:space="0" w:color="auto"/>
+              <w:right w:val="single" w:sz="4" w:space="0" w:color="auto"/>
+            </w:tcBorders>
+            <w:hideMark/>
+          </w:tcPr>
+          <w:p>
+            <w:pPr>
+              <w:tabs>
+                <w:tab w:val="center" w:pos="4677"/>
+                <w:tab w:val="left" w:pos="7873"/>
+              </w:tabs>
+              <w:jc w:val="center"/>
+              <w:rPr>
+                <w:rFonts w:ascii="Times New Roman" w:hAnsi="Times New Roman" w:cs="Times New Roman"/>
+                <w:sz w:val="28"/>
+                <w:szCs w:val="28"/>
+                <w:lang w:eastAsia="ru-RU"/>
+              </w:rPr>
+            </w:pPr>
+            <w:r>
+              <w:rPr>
+                <w:rFonts w:ascii="Times New Roman" w:hAnsi="Times New Roman" w:cs="Times New Roman"/>
+                <w:sz w:val="28"/>
+                <w:szCs w:val="28"/>
+                <w:lang w:eastAsia="ru-RU"/>
+              </w:rPr>
+              <w:t>0,6</w:t>
+            </w:r>
+          </w:p>
+        </w:tc>
+      </w:tr>
+    </w:tbl>
+    <w:p>
+      <w:pPr>
+        <w:spacing w:line="360" w:lineRule="auto"/>
+        <w:rPr>
+          <w:rFonts w:ascii="Times New Roman" w:hAnsi="Times New Roman" w:cs="Times New Roman"/>
           <w:sz w:val="24"/>
           <w:szCs w:val="24"/>
-          <w:lang w:eastAsia="ru-RU"/>
-        </w:rPr>
-        <w:lastRenderedPageBreak/>
+        </w:rPr>
+      </w:pPr>
+    </w:p>
+    <w:p>
+      <w:pPr>
+        <w:spacing w:line="360" w:lineRule="auto"/>
+        <w:jc w:val="center"/>
+        <w:rPr>
+          <w:rFonts w:ascii="Times New Roman" w:hAnsi="Times New Roman" w:cs="Times New Roman"/>
+          <w:sz w:val="24"/>
+        </w:rPr>
+      </w:pPr>
+      <w:r>
+        <w:rPr>
+          <w:rFonts w:ascii="Times New Roman" w:hAnsi="Times New Roman" w:cs="Times New Roman"/>
+          <w:sz w:val="24"/>
+          <w:szCs w:val="24"/>
+        </w:rPr>
         <w:drawing>
-          <wp:inline distT="0" distB="0" distL="0" distR="0" wp14:anchorId="0EF07C95" wp14:editId="05B7AAC1">
-            <wp:extent cx="5071731" cy="2508213"/>
-            <wp:effectExtent l="0" t="0" r="0" b="6985"/>
-            <wp:docPr id="240923832" name="Рисунок 1"/>
+          <wp:inline distT="0" distB="0" distL="0" distR="0" wp14:anchorId="3A9E82FB" wp14:editId="7180027F">
+            <wp:extent cx="5296204" cy="3378496"/>
+            <wp:effectExtent l="0" t="0" r="0" b="0"/>
+            <wp:docPr id="3" name="Рисунок 3"/>
             <wp:cNvGraphicFramePr>
               <a:graphicFrameLocks xmlns:a="http://schemas.openxmlformats.org/drawingml/2006/main" noChangeAspect="1"/>
             </wp:cNvGraphicFramePr>
@@ -1181,7 +2692,7 @@
               <a:graphicData uri="http://schemas.openxmlformats.org/drawingml/2006/picture">
                 <pic:pic xmlns:pic="http://schemas.openxmlformats.org/drawingml/2006/picture">
                   <pic:nvPicPr>
-                    <pic:cNvPr id="240923832" name=""/>
+                    <pic:cNvPr id="1" name=""/>
                     <pic:cNvPicPr/>
                   </pic:nvPicPr>
                   <pic:blipFill>
@@ -1193,7 +2704,7 @@
                   <pic:spPr>
                     <a:xfrm>
                       <a:off x="0" y="0"/>
-                      <a:ext cx="5079605" cy="2512107"/>
+                      <a:ext cx="5309547" cy="3387008"/>
                     </a:xfrm>
                     <a:prstGeom prst="rect">
                       <a:avLst/>
@@ -1212,41 +2723,49 @@
           <w:szCs w:val="24"/>
         </w:rPr>
         <w:br/>
-        <w:t>Рисунок 4 – Дифференцирующая цепочка</w:t>
+      </w:r>
+      <w:r>
+        <w:rPr>
+          <w:rFonts w:ascii="Times New Roman" w:hAnsi="Times New Roman" w:cs="Times New Roman"/>
+          <w:sz w:val="24"/>
+        </w:rPr>
+        <w:t xml:space="preserve">Рисунок 3 — </w:t>
+      </w:r>
+      <w:r>
+        <w:rPr>
+          <w:rFonts w:ascii="Times New Roman" w:hAnsi="Times New Roman" w:cs="Times New Roman"/>
+          <w:sz w:val="24"/>
+        </w:rPr>
+        <w:t>Осциллограмма при частоте 10 кГц</w:t>
       </w:r>
     </w:p>
     <w:p>
       <w:pPr>
         <w:spacing w:line="360" w:lineRule="auto"/>
-        <w:ind w:firstLine="709"/>
         <w:jc w:val="center"/>
         <w:rPr>
           <w:rFonts w:ascii="Times New Roman" w:hAnsi="Times New Roman" w:cs="Times New Roman"/>
           <w:sz w:val="24"/>
-          <w:szCs w:val="24"/>
-        </w:rPr>
-      </w:pPr>
-      <w:r>
-        <w:rPr>
-          <w:rFonts w:ascii="Times New Roman" w:hAnsi="Times New Roman" w:cs="Times New Roman"/>
+        </w:rPr>
+      </w:pPr>
+      <w:r>
+        <w:rPr>
           <w:noProof/>
-          <w:sz w:val="24"/>
-          <w:szCs w:val="24"/>
           <w:lang w:eastAsia="ru-RU"/>
-        </w:rPr>
+          <w14:ligatures w14:val="standardContextual"/>
+        </w:rPr>
+        <w:lastRenderedPageBreak/>
         <w:drawing>
-          <wp:inline distT="0" distB="0" distL="0" distR="0" wp14:anchorId="5D38A712" wp14:editId="3570BEE8">
-            <wp:extent cx="5247943" cy="3296093"/>
-            <wp:effectExtent l="0" t="0" r="0" b="0"/>
-            <wp:docPr id="1236265790" name="Рисунок 1"/>
-            <wp:cNvGraphicFramePr>
-              <a:graphicFrameLocks xmlns:a="http://schemas.openxmlformats.org/drawingml/2006/main" noChangeAspect="1"/>
-            </wp:cNvGraphicFramePr>
+          <wp:inline distT="0" distB="0" distL="0" distR="0" wp14:anchorId="18723709" wp14:editId="0632C84E">
+            <wp:extent cx="5939790" cy="3754755"/>
+            <wp:effectExtent l="0" t="0" r="3810" b="0"/>
+            <wp:docPr id="4" name="Рисунок 4"/>
+            <wp:cNvGraphicFramePr/>
             <a:graphic xmlns:a="http://schemas.openxmlformats.org/drawingml/2006/main">
               <a:graphicData uri="http://schemas.openxmlformats.org/drawingml/2006/picture">
                 <pic:pic xmlns:pic="http://schemas.openxmlformats.org/drawingml/2006/picture">
                   <pic:nvPicPr>
-                    <pic:cNvPr id="1236265790" name=""/>
+                    <pic:cNvPr id="4" name="Рисунок 4"/>
                     <pic:cNvPicPr/>
                   </pic:nvPicPr>
                   <pic:blipFill>
@@ -1258,7 +2777,7 @@
                   <pic:spPr>
                     <a:xfrm>
                       <a:off x="0" y="0"/>
-                      <a:ext cx="5267861" cy="3308603"/>
+                      <a:ext cx="5939790" cy="3754755"/>
                     </a:xfrm>
                     <a:prstGeom prst="rect">
                       <a:avLst/>
@@ -1274,68 +2793,47 @@
         <w:rPr>
           <w:rFonts w:ascii="Times New Roman" w:hAnsi="Times New Roman" w:cs="Times New Roman"/>
           <w:sz w:val="24"/>
-          <w:szCs w:val="24"/>
         </w:rPr>
         <w:br/>
-        <w:t xml:space="preserve">Рисунок </w:t>
       </w:r>
       <w:r>
         <w:rPr>
           <w:rFonts w:ascii="Times New Roman" w:hAnsi="Times New Roman" w:cs="Times New Roman"/>
           <w:sz w:val="24"/>
-          <w:szCs w:val="24"/>
-        </w:rPr>
-        <w:t>5</w:t>
-      </w:r>
-      <w:r>
-        <w:rPr>
-          <w:rFonts w:ascii="Times New Roman" w:hAnsi="Times New Roman" w:cs="Times New Roman"/>
-          <w:sz w:val="24"/>
-          <w:szCs w:val="24"/>
-        </w:rPr>
-        <w:t xml:space="preserve"> – Значения осциллографа для </w:t>
-      </w:r>
-      <w:proofErr w:type="spellStart"/>
-      <w:r>
-        <w:rPr>
-          <w:rFonts w:ascii="Times New Roman" w:hAnsi="Times New Roman" w:cs="Times New Roman"/>
-          <w:sz w:val="24"/>
-          <w:szCs w:val="24"/>
-        </w:rPr>
-        <w:t>дифцепочки</w:t>
-      </w:r>
-      <w:proofErr w:type="spellEnd"/>
+        </w:rPr>
+        <w:t>Рисунок 4 — Осциллограмма при частоте 50 кГц</w:t>
+      </w:r>
     </w:p>
     <w:p>
       <w:pPr>
-        <w:spacing w:line="360" w:lineRule="auto"/>
-        <w:ind w:firstLine="709"/>
+        <w:tabs>
+          <w:tab w:val="center" w:pos="4677"/>
+          <w:tab w:val="left" w:pos="7873"/>
+        </w:tabs>
         <w:jc w:val="center"/>
         <w:rPr>
           <w:rFonts w:ascii="Times New Roman" w:hAnsi="Times New Roman" w:cs="Times New Roman"/>
           <w:sz w:val="24"/>
-          <w:szCs w:val="24"/>
+          <w:szCs w:val="28"/>
         </w:rPr>
       </w:pPr>
       <w:r>
         <w:rPr>
           <w:noProof/>
           <w:lang w:eastAsia="ru-RU"/>
-        </w:rPr>
-        <w:lastRenderedPageBreak/>
+          <w14:ligatures w14:val="standardContextual"/>
+        </w:rPr>
         <w:drawing>
-          <wp:inline distT="0" distB="0" distL="0" distR="0" wp14:anchorId="354358F2" wp14:editId="4B887763">
-            <wp:extent cx="5314950" cy="2541290"/>
-            <wp:effectExtent l="0" t="0" r="0" b="0"/>
-            <wp:docPr id="13" name="Рисунок 13"/>
-            <wp:cNvGraphicFramePr>
-              <a:graphicFrameLocks xmlns:a="http://schemas.openxmlformats.org/drawingml/2006/main" noChangeAspect="1"/>
-            </wp:cNvGraphicFramePr>
+          <wp:inline distT="0" distB="0" distL="0" distR="0" wp14:anchorId="24AEC53E" wp14:editId="43D96570">
+            <wp:extent cx="5939790" cy="3733165"/>
+            <wp:effectExtent l="0" t="0" r="3810" b="635"/>
+            <wp:docPr id="5" name="Рисунок 5"/>
+            <wp:cNvGraphicFramePr/>
             <a:graphic xmlns:a="http://schemas.openxmlformats.org/drawingml/2006/main">
               <a:graphicData uri="http://schemas.openxmlformats.org/drawingml/2006/picture">
                 <pic:pic xmlns:pic="http://schemas.openxmlformats.org/drawingml/2006/picture">
                   <pic:nvPicPr>
-                    <pic:cNvPr id="1" name=""/>
+                    <pic:cNvPr id="5" name="Рисунок 5"/>
                     <pic:cNvPicPr/>
                   </pic:nvPicPr>
                   <pic:blipFill>
@@ -1347,7 +2845,7 @@
                   <pic:spPr>
                     <a:xfrm>
                       <a:off x="0" y="0"/>
-                      <a:ext cx="5323027" cy="2545152"/>
+                      <a:ext cx="5939790" cy="3733165"/>
                     </a:xfrm>
                     <a:prstGeom prst="rect">
                       <a:avLst/>
@@ -1363,36 +2861,62 @@
         <w:rPr>
           <w:rFonts w:ascii="Times New Roman" w:hAnsi="Times New Roman" w:cs="Times New Roman"/>
           <w:sz w:val="24"/>
-          <w:szCs w:val="24"/>
         </w:rPr>
         <w:br/>
-        <w:t>Рисунок 6 – АЧХ и ФЧХ интегрирующей цепочки</w:t>
+      </w:r>
+      <w:r>
+        <w:rPr>
+          <w:rFonts w:ascii="Times New Roman" w:hAnsi="Times New Roman" w:cs="Times New Roman"/>
+          <w:sz w:val="24"/>
+        </w:rPr>
+        <w:t xml:space="preserve">Рисунок 5 — </w:t>
+      </w:r>
+      <w:r>
+        <w:rPr>
+          <w:rFonts w:ascii="Times New Roman" w:hAnsi="Times New Roman" w:cs="Times New Roman"/>
+          <w:sz w:val="24"/>
+          <w:szCs w:val="28"/>
+        </w:rPr>
+        <w:t>Осциллограмма при частоте 100 кГц</w:t>
       </w:r>
     </w:p>
     <w:p>
       <w:pPr>
-        <w:spacing w:line="360" w:lineRule="auto"/>
-        <w:ind w:firstLine="709"/>
+        <w:rPr>
+          <w:rFonts w:ascii="Times New Roman" w:hAnsi="Times New Roman" w:cs="Times New Roman"/>
+          <w:b/>
+          <w:sz w:val="28"/>
+        </w:rPr>
+      </w:pPr>
+      <w:r>
+        <w:rPr>
+          <w:rFonts w:ascii="Times New Roman" w:hAnsi="Times New Roman" w:cs="Times New Roman"/>
+          <w:b/>
+          <w:sz w:val="28"/>
+        </w:rPr>
+        <w:br w:type="page"/>
+      </w:r>
+    </w:p>
+    <w:p>
+      <w:pPr>
         <w:jc w:val="center"/>
         <w:rPr>
           <w:rFonts w:ascii="Times New Roman" w:hAnsi="Times New Roman" w:cs="Times New Roman"/>
           <w:sz w:val="24"/>
-          <w:szCs w:val="24"/>
-        </w:rPr>
-      </w:pPr>
-      <w:r>
-        <w:rPr>
-          <w:rFonts w:ascii="Times New Roman" w:eastAsiaTheme="minorEastAsia" w:hAnsi="Times New Roman" w:cs="Times New Roman"/>
-          <w:noProof/>
-          <w:sz w:val="24"/>
-          <w:szCs w:val="28"/>
-          <w:lang w:eastAsia="ru-RU"/>
-        </w:rPr>
+        </w:rPr>
+      </w:pPr>
+      <w:r>
+        <w:rPr>
+          <w:rFonts w:ascii="Times New Roman" w:hAnsi="Times New Roman" w:cs="Times New Roman"/>
+          <w:b/>
+          <w:sz w:val="28"/>
+        </w:rPr>
+        <w:lastRenderedPageBreak/>
         <w:drawing>
-          <wp:inline distT="0" distB="0" distL="0" distR="0" wp14:anchorId="3CEC02C8" wp14:editId="5A0927B7">
-            <wp:extent cx="5559148" cy="2647950"/>
-            <wp:effectExtent l="0" t="0" r="3810" b="0"/>
-            <wp:docPr id="12" name="Рисунок 12"/>
+          <wp:inline distT="0" distB="0" distL="0" distR="0" wp14:anchorId="5939D60C" wp14:editId="4483D0B7">
+            <wp:extent cx="5618073" cy="4167008"/>
+            <wp:effectExtent l="0" t="0" r="1905" b="5080"/>
+            <wp:docPr id="6" name="Рисунок 6"/>
             <wp:cNvGraphicFramePr>
               <a:graphicFrameLocks xmlns:a="http://schemas.openxmlformats.org/drawingml/2006/main" noChangeAspect="1"/>
             </wp:cNvGraphicFramePr>
@@ -1412,7 +2936,7 @@
                   <pic:spPr>
                     <a:xfrm>
                       <a:off x="0" y="0"/>
-                      <a:ext cx="5568608" cy="2652456"/>
+                      <a:ext cx="5647179" cy="4188596"/>
                     </a:xfrm>
                     <a:prstGeom prst="rect">
                       <a:avLst/>
@@ -1427,11 +2951,1048 @@
       <w:r>
         <w:rPr>
           <w:rFonts w:ascii="Times New Roman" w:hAnsi="Times New Roman" w:cs="Times New Roman"/>
+          <w:b/>
+          <w:sz w:val="28"/>
+        </w:rPr>
+        <w:br/>
+      </w:r>
+      <w:r>
+        <w:rPr>
+          <w:rFonts w:ascii="Times New Roman" w:hAnsi="Times New Roman" w:cs="Times New Roman"/>
           <w:sz w:val="24"/>
-          <w:szCs w:val="24"/>
+        </w:rPr>
+        <w:t>Рисунок 6 — Схема транзитного ключа на КМОП транзисторах</w:t>
+      </w:r>
+    </w:p>
+    <w:p>
+      <w:pPr>
+        <w:jc w:val="center"/>
+        <w:rPr>
+          <w:rFonts w:ascii="Times New Roman" w:hAnsi="Times New Roman" w:cs="Times New Roman"/>
+          <w:sz w:val="24"/>
+        </w:rPr>
+      </w:pPr>
+    </w:p>
+    <w:tbl>
+      <w:tblPr>
+        <w:tblStyle w:val="ac"/>
+        <w:tblW w:w="0" w:type="auto"/>
+        <w:tblLook w:val="04A0" w:firstRow="1" w:lastRow="0" w:firstColumn="1" w:lastColumn="0" w:noHBand="0" w:noVBand="1"/>
+      </w:tblPr>
+      <w:tblGrid>
+        <w:gridCol w:w="2489"/>
+        <w:gridCol w:w="2331"/>
+        <w:gridCol w:w="2331"/>
+        <w:gridCol w:w="2193"/>
+      </w:tblGrid>
+      <w:tr>
+        <w:tc>
+          <w:tcPr>
+            <w:tcW w:w="2489" w:type="dxa"/>
+            <w:tcBorders>
+              <w:top w:val="single" w:sz="4" w:space="0" w:color="auto"/>
+              <w:left w:val="single" w:sz="4" w:space="0" w:color="auto"/>
+              <w:bottom w:val="single" w:sz="4" w:space="0" w:color="auto"/>
+              <w:right w:val="single" w:sz="4" w:space="0" w:color="auto"/>
+            </w:tcBorders>
+            <w:hideMark/>
+          </w:tcPr>
+          <w:p>
+            <w:pPr>
+              <w:tabs>
+                <w:tab w:val="center" w:pos="4677"/>
+                <w:tab w:val="left" w:pos="7873"/>
+              </w:tabs>
+              <w:jc w:val="center"/>
+              <w:rPr>
+                <w:rFonts w:ascii="Times New Roman" w:hAnsi="Times New Roman" w:cs="Times New Roman"/>
+                <w:sz w:val="28"/>
+                <w:szCs w:val="28"/>
+                <w:lang w:val="en-US" w:eastAsia="ru-RU"/>
+              </w:rPr>
+            </w:pPr>
+            <w:r>
+              <w:rPr>
+                <w:rFonts w:ascii="Times New Roman" w:hAnsi="Times New Roman" w:cs="Times New Roman"/>
+                <w:sz w:val="28"/>
+                <w:szCs w:val="28"/>
+                <w:lang w:eastAsia="ru-RU"/>
+              </w:rPr>
+              <w:t>Частота</w:t>
+            </w:r>
+            <w:r>
+              <w:rPr>
+                <w:rFonts w:ascii="Times New Roman" w:hAnsi="Times New Roman" w:cs="Times New Roman"/>
+                <w:sz w:val="28"/>
+                <w:szCs w:val="28"/>
+                <w:lang w:val="en-US" w:eastAsia="ru-RU"/>
+              </w:rPr>
+              <w:t>,</w:t>
+            </w:r>
+            <w:r>
+              <w:rPr>
+                <w:rFonts w:ascii="Times New Roman" w:hAnsi="Times New Roman" w:cs="Times New Roman"/>
+                <w:sz w:val="28"/>
+                <w:szCs w:val="28"/>
+                <w:lang w:val="en-US" w:eastAsia="ru-RU"/>
+              </w:rPr>
+              <w:t xml:space="preserve"> </w:t>
+            </w:r>
+            <w:r>
+              <w:rPr>
+                <w:rFonts w:ascii="Times New Roman" w:hAnsi="Times New Roman" w:cs="Times New Roman"/>
+                <w:sz w:val="28"/>
+                <w:szCs w:val="28"/>
+                <w:lang w:eastAsia="ru-RU"/>
+              </w:rPr>
+              <w:t>кГц</w:t>
+            </w:r>
+          </w:p>
+        </w:tc>
+        <w:tc>
+          <w:tcPr>
+            <w:tcW w:w="2331" w:type="dxa"/>
+            <w:tcBorders>
+              <w:top w:val="single" w:sz="4" w:space="0" w:color="auto"/>
+              <w:left w:val="single" w:sz="4" w:space="0" w:color="auto"/>
+              <w:bottom w:val="single" w:sz="4" w:space="0" w:color="auto"/>
+              <w:right w:val="single" w:sz="4" w:space="0" w:color="auto"/>
+            </w:tcBorders>
+            <w:hideMark/>
+          </w:tcPr>
+          <w:p>
+            <w:pPr>
+              <w:tabs>
+                <w:tab w:val="center" w:pos="4677"/>
+                <w:tab w:val="left" w:pos="7873"/>
+              </w:tabs>
+              <w:jc w:val="center"/>
+              <w:rPr>
+                <w:rFonts w:ascii="Times New Roman" w:hAnsi="Times New Roman" w:cs="Times New Roman"/>
+                <w:sz w:val="28"/>
+                <w:szCs w:val="28"/>
+                <w:lang w:eastAsia="ru-RU"/>
+              </w:rPr>
+            </w:pPr>
+            <w:r>
+              <w:rPr>
+                <w:rFonts w:ascii="Times New Roman" w:hAnsi="Times New Roman" w:cs="Times New Roman"/>
+                <w:sz w:val="28"/>
+                <w:szCs w:val="28"/>
+                <w:lang w:val="en-US" w:eastAsia="ru-RU"/>
+              </w:rPr>
+              <w:t>t</w:t>
+            </w:r>
+            <w:r>
+              <w:rPr>
+                <w:rFonts w:ascii="Times New Roman" w:hAnsi="Times New Roman" w:cs="Times New Roman"/>
+                <w:sz w:val="28"/>
+                <w:szCs w:val="28"/>
+                <w:vertAlign w:val="subscript"/>
+                <w:lang w:val="en-US" w:eastAsia="ru-RU"/>
+              </w:rPr>
+              <w:t>1</w:t>
+            </w:r>
+            <w:r>
+              <w:rPr>
+                <w:rFonts w:ascii="Times New Roman" w:hAnsi="Times New Roman" w:cs="Times New Roman"/>
+                <w:sz w:val="28"/>
+                <w:szCs w:val="28"/>
+                <w:lang w:val="en-US" w:eastAsia="ru-RU"/>
+              </w:rPr>
+              <w:t>,</w:t>
+            </w:r>
+            <w:r>
+              <w:rPr>
+                <w:rFonts w:ascii="Times New Roman" w:hAnsi="Times New Roman" w:cs="Times New Roman"/>
+                <w:sz w:val="28"/>
+                <w:szCs w:val="28"/>
+                <w:lang w:eastAsia="ru-RU"/>
+              </w:rPr>
+              <w:t xml:space="preserve"> </w:t>
+            </w:r>
+            <w:proofErr w:type="spellStart"/>
+            <w:r>
+              <w:rPr>
+                <w:rFonts w:ascii="Times New Roman" w:hAnsi="Times New Roman" w:cs="Times New Roman"/>
+                <w:sz w:val="28"/>
+                <w:szCs w:val="28"/>
+                <w:lang w:eastAsia="ru-RU"/>
+              </w:rPr>
+              <w:t>мкс</w:t>
+            </w:r>
+            <w:proofErr w:type="spellEnd"/>
+          </w:p>
+        </w:tc>
+        <w:tc>
+          <w:tcPr>
+            <w:tcW w:w="2331" w:type="dxa"/>
+            <w:tcBorders>
+              <w:top w:val="single" w:sz="4" w:space="0" w:color="auto"/>
+              <w:left w:val="single" w:sz="4" w:space="0" w:color="auto"/>
+              <w:bottom w:val="single" w:sz="4" w:space="0" w:color="auto"/>
+              <w:right w:val="single" w:sz="4" w:space="0" w:color="auto"/>
+            </w:tcBorders>
+            <w:hideMark/>
+          </w:tcPr>
+          <w:p>
+            <w:pPr>
+              <w:tabs>
+                <w:tab w:val="center" w:pos="4677"/>
+                <w:tab w:val="left" w:pos="7873"/>
+              </w:tabs>
+              <w:jc w:val="center"/>
+              <w:rPr>
+                <w:rFonts w:ascii="Times New Roman" w:hAnsi="Times New Roman" w:cs="Times New Roman"/>
+                <w:sz w:val="28"/>
+                <w:szCs w:val="28"/>
+                <w:lang w:eastAsia="ru-RU"/>
+              </w:rPr>
+            </w:pPr>
+            <w:r>
+              <w:rPr>
+                <w:rFonts w:ascii="Times New Roman" w:hAnsi="Times New Roman" w:cs="Times New Roman"/>
+                <w:sz w:val="28"/>
+                <w:szCs w:val="28"/>
+                <w:lang w:val="en-US" w:eastAsia="ru-RU"/>
+              </w:rPr>
+              <w:t>t</w:t>
+            </w:r>
+            <w:r>
+              <w:rPr>
+                <w:rFonts w:ascii="Times New Roman" w:hAnsi="Times New Roman" w:cs="Times New Roman"/>
+                <w:sz w:val="28"/>
+                <w:szCs w:val="28"/>
+                <w:vertAlign w:val="subscript"/>
+                <w:lang w:val="en-US" w:eastAsia="ru-RU"/>
+              </w:rPr>
+              <w:t>2</w:t>
+            </w:r>
+            <w:r>
+              <w:rPr>
+                <w:rFonts w:ascii="Times New Roman" w:hAnsi="Times New Roman" w:cs="Times New Roman"/>
+                <w:sz w:val="28"/>
+                <w:szCs w:val="28"/>
+                <w:lang w:val="en-US" w:eastAsia="ru-RU"/>
+              </w:rPr>
+              <w:t>,</w:t>
+            </w:r>
+            <w:r>
+              <w:rPr>
+                <w:rFonts w:ascii="Times New Roman" w:hAnsi="Times New Roman" w:cs="Times New Roman"/>
+                <w:sz w:val="28"/>
+                <w:szCs w:val="28"/>
+                <w:lang w:eastAsia="ru-RU"/>
+              </w:rPr>
+              <w:t xml:space="preserve"> </w:t>
+            </w:r>
+            <w:proofErr w:type="spellStart"/>
+            <w:r>
+              <w:rPr>
+                <w:rFonts w:ascii="Times New Roman" w:hAnsi="Times New Roman" w:cs="Times New Roman"/>
+                <w:sz w:val="28"/>
+                <w:szCs w:val="28"/>
+                <w:lang w:eastAsia="ru-RU"/>
+              </w:rPr>
+              <w:t>мкс</w:t>
+            </w:r>
+            <w:proofErr w:type="spellEnd"/>
+          </w:p>
+        </w:tc>
+        <w:tc>
+          <w:tcPr>
+            <w:tcW w:w="2193" w:type="dxa"/>
+            <w:tcBorders>
+              <w:top w:val="single" w:sz="4" w:space="0" w:color="auto"/>
+              <w:left w:val="single" w:sz="4" w:space="0" w:color="auto"/>
+              <w:bottom w:val="single" w:sz="4" w:space="0" w:color="auto"/>
+              <w:right w:val="single" w:sz="4" w:space="0" w:color="auto"/>
+            </w:tcBorders>
+          </w:tcPr>
+          <w:p>
+            <w:pPr>
+              <w:tabs>
+                <w:tab w:val="center" w:pos="4677"/>
+                <w:tab w:val="left" w:pos="7873"/>
+              </w:tabs>
+              <w:jc w:val="center"/>
+              <w:rPr>
+                <w:rFonts w:ascii="Times New Roman" w:hAnsi="Times New Roman" w:cs="Times New Roman"/>
+                <w:sz w:val="28"/>
+                <w:szCs w:val="28"/>
+                <w:lang w:eastAsia="ru-RU"/>
+              </w:rPr>
+            </w:pPr>
+            <w:r>
+              <w:rPr>
+                <w:rFonts w:ascii="Times New Roman" w:hAnsi="Times New Roman" w:cs="Times New Roman"/>
+                <w:sz w:val="28"/>
+                <w:szCs w:val="28"/>
+                <w:lang w:val="en-US" w:eastAsia="ru-RU"/>
+              </w:rPr>
+              <w:t xml:space="preserve">I, </w:t>
+            </w:r>
+            <w:r>
+              <w:rPr>
+                <w:rFonts w:ascii="Times New Roman" w:hAnsi="Times New Roman" w:cs="Times New Roman"/>
+                <w:sz w:val="28"/>
+                <w:szCs w:val="28"/>
+                <w:lang w:eastAsia="ru-RU"/>
+              </w:rPr>
+              <w:t>мкА</w:t>
+            </w:r>
+          </w:p>
+        </w:tc>
+      </w:tr>
+      <w:tr>
+        <w:tc>
+          <w:tcPr>
+            <w:tcW w:w="2489" w:type="dxa"/>
+            <w:tcBorders>
+              <w:top w:val="single" w:sz="4" w:space="0" w:color="auto"/>
+              <w:left w:val="single" w:sz="4" w:space="0" w:color="auto"/>
+              <w:bottom w:val="single" w:sz="4" w:space="0" w:color="auto"/>
+              <w:right w:val="single" w:sz="4" w:space="0" w:color="auto"/>
+            </w:tcBorders>
+            <w:hideMark/>
+          </w:tcPr>
+          <w:p>
+            <w:pPr>
+              <w:tabs>
+                <w:tab w:val="center" w:pos="4677"/>
+                <w:tab w:val="left" w:pos="7873"/>
+              </w:tabs>
+              <w:jc w:val="center"/>
+              <w:rPr>
+                <w:rFonts w:ascii="Times New Roman" w:hAnsi="Times New Roman" w:cs="Times New Roman"/>
+                <w:sz w:val="28"/>
+                <w:szCs w:val="28"/>
+                <w:lang w:eastAsia="ru-RU"/>
+              </w:rPr>
+            </w:pPr>
+            <w:r>
+              <w:rPr>
+                <w:rFonts w:ascii="Times New Roman" w:hAnsi="Times New Roman" w:cs="Times New Roman"/>
+                <w:sz w:val="28"/>
+                <w:szCs w:val="28"/>
+                <w:lang w:eastAsia="ru-RU"/>
+              </w:rPr>
+              <w:t>10</w:t>
+            </w:r>
+          </w:p>
+        </w:tc>
+        <w:tc>
+          <w:tcPr>
+            <w:tcW w:w="2331" w:type="dxa"/>
+            <w:tcBorders>
+              <w:top w:val="single" w:sz="4" w:space="0" w:color="auto"/>
+              <w:left w:val="single" w:sz="4" w:space="0" w:color="auto"/>
+              <w:bottom w:val="single" w:sz="4" w:space="0" w:color="auto"/>
+              <w:right w:val="single" w:sz="4" w:space="0" w:color="auto"/>
+            </w:tcBorders>
+            <w:hideMark/>
+          </w:tcPr>
+          <w:p>
+            <w:pPr>
+              <w:tabs>
+                <w:tab w:val="center" w:pos="4677"/>
+                <w:tab w:val="left" w:pos="7873"/>
+              </w:tabs>
+              <w:jc w:val="center"/>
+              <w:rPr>
+                <w:rFonts w:ascii="Times New Roman" w:hAnsi="Times New Roman" w:cs="Times New Roman"/>
+                <w:sz w:val="28"/>
+                <w:szCs w:val="28"/>
+                <w:lang w:eastAsia="ru-RU"/>
+              </w:rPr>
+            </w:pPr>
+            <w:r>
+              <w:rPr>
+                <w:rFonts w:ascii="Times New Roman" w:hAnsi="Times New Roman" w:cs="Times New Roman"/>
+                <w:sz w:val="28"/>
+                <w:szCs w:val="28"/>
+                <w:lang w:eastAsia="ru-RU"/>
+              </w:rPr>
+              <w:t>0,2</w:t>
+            </w:r>
+          </w:p>
+        </w:tc>
+        <w:tc>
+          <w:tcPr>
+            <w:tcW w:w="2331" w:type="dxa"/>
+            <w:tcBorders>
+              <w:top w:val="single" w:sz="4" w:space="0" w:color="auto"/>
+              <w:left w:val="single" w:sz="4" w:space="0" w:color="auto"/>
+              <w:bottom w:val="single" w:sz="4" w:space="0" w:color="auto"/>
+              <w:right w:val="single" w:sz="4" w:space="0" w:color="auto"/>
+            </w:tcBorders>
+            <w:hideMark/>
+          </w:tcPr>
+          <w:p>
+            <w:pPr>
+              <w:tabs>
+                <w:tab w:val="center" w:pos="4677"/>
+                <w:tab w:val="left" w:pos="7873"/>
+              </w:tabs>
+              <w:jc w:val="center"/>
+              <w:rPr>
+                <w:rFonts w:ascii="Times New Roman" w:hAnsi="Times New Roman" w:cs="Times New Roman"/>
+                <w:sz w:val="28"/>
+                <w:szCs w:val="28"/>
+                <w:lang w:eastAsia="ru-RU"/>
+              </w:rPr>
+            </w:pPr>
+            <w:r>
+              <w:rPr>
+                <w:rFonts w:ascii="Times New Roman" w:hAnsi="Times New Roman" w:cs="Times New Roman"/>
+                <w:sz w:val="28"/>
+                <w:szCs w:val="28"/>
+                <w:lang w:eastAsia="ru-RU"/>
+              </w:rPr>
+              <w:t>0,4</w:t>
+            </w:r>
+          </w:p>
+        </w:tc>
+        <w:tc>
+          <w:tcPr>
+            <w:tcW w:w="2193" w:type="dxa"/>
+            <w:tcBorders>
+              <w:top w:val="single" w:sz="4" w:space="0" w:color="auto"/>
+              <w:left w:val="single" w:sz="4" w:space="0" w:color="auto"/>
+              <w:bottom w:val="single" w:sz="4" w:space="0" w:color="auto"/>
+              <w:right w:val="single" w:sz="4" w:space="0" w:color="auto"/>
+            </w:tcBorders>
+          </w:tcPr>
+          <w:p>
+            <w:pPr>
+              <w:tabs>
+                <w:tab w:val="center" w:pos="4677"/>
+                <w:tab w:val="left" w:pos="7873"/>
+              </w:tabs>
+              <w:jc w:val="center"/>
+              <w:rPr>
+                <w:rFonts w:ascii="Times New Roman" w:hAnsi="Times New Roman" w:cs="Times New Roman"/>
+                <w:sz w:val="28"/>
+                <w:szCs w:val="28"/>
+                <w:lang w:eastAsia="ru-RU"/>
+              </w:rPr>
+            </w:pPr>
+            <w:r>
+              <w:rPr>
+                <w:rFonts w:ascii="Times New Roman" w:hAnsi="Times New Roman" w:cs="Times New Roman"/>
+                <w:sz w:val="28"/>
+                <w:szCs w:val="28"/>
+                <w:lang w:eastAsia="ru-RU"/>
+              </w:rPr>
+              <w:t>0,15</w:t>
+            </w:r>
+          </w:p>
+        </w:tc>
+      </w:tr>
+      <w:tr>
+        <w:tc>
+          <w:tcPr>
+            <w:tcW w:w="2489" w:type="dxa"/>
+            <w:tcBorders>
+              <w:top w:val="single" w:sz="4" w:space="0" w:color="auto"/>
+              <w:left w:val="single" w:sz="4" w:space="0" w:color="auto"/>
+              <w:bottom w:val="single" w:sz="4" w:space="0" w:color="auto"/>
+              <w:right w:val="single" w:sz="4" w:space="0" w:color="auto"/>
+            </w:tcBorders>
+            <w:hideMark/>
+          </w:tcPr>
+          <w:p>
+            <w:pPr>
+              <w:tabs>
+                <w:tab w:val="center" w:pos="4677"/>
+                <w:tab w:val="left" w:pos="7873"/>
+              </w:tabs>
+              <w:jc w:val="center"/>
+              <w:rPr>
+                <w:rFonts w:ascii="Times New Roman" w:hAnsi="Times New Roman" w:cs="Times New Roman"/>
+                <w:sz w:val="28"/>
+                <w:szCs w:val="28"/>
+                <w:lang w:eastAsia="ru-RU"/>
+              </w:rPr>
+            </w:pPr>
+            <w:r>
+              <w:rPr>
+                <w:rFonts w:ascii="Times New Roman" w:hAnsi="Times New Roman" w:cs="Times New Roman"/>
+                <w:sz w:val="28"/>
+                <w:szCs w:val="28"/>
+                <w:lang w:eastAsia="ru-RU"/>
+              </w:rPr>
+              <w:t>50</w:t>
+            </w:r>
+          </w:p>
+        </w:tc>
+        <w:tc>
+          <w:tcPr>
+            <w:tcW w:w="2331" w:type="dxa"/>
+            <w:tcBorders>
+              <w:top w:val="single" w:sz="4" w:space="0" w:color="auto"/>
+              <w:left w:val="single" w:sz="4" w:space="0" w:color="auto"/>
+              <w:bottom w:val="single" w:sz="4" w:space="0" w:color="auto"/>
+              <w:right w:val="single" w:sz="4" w:space="0" w:color="auto"/>
+            </w:tcBorders>
+            <w:hideMark/>
+          </w:tcPr>
+          <w:p>
+            <w:pPr>
+              <w:tabs>
+                <w:tab w:val="center" w:pos="4677"/>
+                <w:tab w:val="left" w:pos="7873"/>
+              </w:tabs>
+              <w:jc w:val="center"/>
+              <w:rPr>
+                <w:rFonts w:ascii="Times New Roman" w:hAnsi="Times New Roman" w:cs="Times New Roman"/>
+                <w:sz w:val="28"/>
+                <w:szCs w:val="28"/>
+                <w:lang w:eastAsia="ru-RU"/>
+              </w:rPr>
+            </w:pPr>
+            <w:r>
+              <w:rPr>
+                <w:rFonts w:ascii="Times New Roman" w:hAnsi="Times New Roman" w:cs="Times New Roman"/>
+                <w:sz w:val="28"/>
+                <w:szCs w:val="28"/>
+                <w:lang w:eastAsia="ru-RU"/>
+              </w:rPr>
+              <w:t>0,2</w:t>
+            </w:r>
+          </w:p>
+        </w:tc>
+        <w:tc>
+          <w:tcPr>
+            <w:tcW w:w="2331" w:type="dxa"/>
+            <w:tcBorders>
+              <w:top w:val="single" w:sz="4" w:space="0" w:color="auto"/>
+              <w:left w:val="single" w:sz="4" w:space="0" w:color="auto"/>
+              <w:bottom w:val="single" w:sz="4" w:space="0" w:color="auto"/>
+              <w:right w:val="single" w:sz="4" w:space="0" w:color="auto"/>
+            </w:tcBorders>
+            <w:hideMark/>
+          </w:tcPr>
+          <w:p>
+            <w:pPr>
+              <w:tabs>
+                <w:tab w:val="center" w:pos="4677"/>
+                <w:tab w:val="left" w:pos="7873"/>
+              </w:tabs>
+              <w:jc w:val="center"/>
+              <w:rPr>
+                <w:rFonts w:ascii="Times New Roman" w:hAnsi="Times New Roman" w:cs="Times New Roman"/>
+                <w:sz w:val="28"/>
+                <w:szCs w:val="28"/>
+                <w:lang w:eastAsia="ru-RU"/>
+              </w:rPr>
+            </w:pPr>
+            <w:r>
+              <w:rPr>
+                <w:rFonts w:ascii="Times New Roman" w:hAnsi="Times New Roman" w:cs="Times New Roman"/>
+                <w:sz w:val="28"/>
+                <w:szCs w:val="28"/>
+                <w:lang w:eastAsia="ru-RU"/>
+              </w:rPr>
+              <w:t>0,4</w:t>
+            </w:r>
+          </w:p>
+        </w:tc>
+        <w:tc>
+          <w:tcPr>
+            <w:tcW w:w="2193" w:type="dxa"/>
+            <w:tcBorders>
+              <w:top w:val="single" w:sz="4" w:space="0" w:color="auto"/>
+              <w:left w:val="single" w:sz="4" w:space="0" w:color="auto"/>
+              <w:bottom w:val="single" w:sz="4" w:space="0" w:color="auto"/>
+              <w:right w:val="single" w:sz="4" w:space="0" w:color="auto"/>
+            </w:tcBorders>
+          </w:tcPr>
+          <w:p>
+            <w:pPr>
+              <w:tabs>
+                <w:tab w:val="center" w:pos="4677"/>
+                <w:tab w:val="left" w:pos="7873"/>
+              </w:tabs>
+              <w:jc w:val="center"/>
+              <w:rPr>
+                <w:rFonts w:ascii="Times New Roman" w:hAnsi="Times New Roman" w:cs="Times New Roman"/>
+                <w:sz w:val="28"/>
+                <w:szCs w:val="28"/>
+                <w:lang w:eastAsia="ru-RU"/>
+              </w:rPr>
+            </w:pPr>
+            <w:r>
+              <w:rPr>
+                <w:rFonts w:ascii="Times New Roman" w:hAnsi="Times New Roman" w:cs="Times New Roman"/>
+                <w:sz w:val="28"/>
+                <w:szCs w:val="28"/>
+                <w:lang w:eastAsia="ru-RU"/>
+              </w:rPr>
+              <w:t>0,15</w:t>
+            </w:r>
+          </w:p>
+        </w:tc>
+      </w:tr>
+      <w:tr>
+        <w:tc>
+          <w:tcPr>
+            <w:tcW w:w="2489" w:type="dxa"/>
+            <w:tcBorders>
+              <w:top w:val="single" w:sz="4" w:space="0" w:color="auto"/>
+              <w:left w:val="single" w:sz="4" w:space="0" w:color="auto"/>
+              <w:bottom w:val="single" w:sz="4" w:space="0" w:color="auto"/>
+              <w:right w:val="single" w:sz="4" w:space="0" w:color="auto"/>
+            </w:tcBorders>
+            <w:hideMark/>
+          </w:tcPr>
+          <w:p>
+            <w:pPr>
+              <w:tabs>
+                <w:tab w:val="center" w:pos="4677"/>
+                <w:tab w:val="left" w:pos="7873"/>
+              </w:tabs>
+              <w:jc w:val="center"/>
+              <w:rPr>
+                <w:rFonts w:ascii="Times New Roman" w:hAnsi="Times New Roman" w:cs="Times New Roman"/>
+                <w:sz w:val="28"/>
+                <w:szCs w:val="28"/>
+                <w:lang w:eastAsia="ru-RU"/>
+              </w:rPr>
+            </w:pPr>
+            <w:r>
+              <w:rPr>
+                <w:rFonts w:ascii="Times New Roman" w:hAnsi="Times New Roman" w:cs="Times New Roman"/>
+                <w:sz w:val="28"/>
+                <w:szCs w:val="28"/>
+                <w:lang w:eastAsia="ru-RU"/>
+              </w:rPr>
+              <w:t>100</w:t>
+            </w:r>
+          </w:p>
+        </w:tc>
+        <w:tc>
+          <w:tcPr>
+            <w:tcW w:w="2331" w:type="dxa"/>
+            <w:tcBorders>
+              <w:top w:val="single" w:sz="4" w:space="0" w:color="auto"/>
+              <w:left w:val="single" w:sz="4" w:space="0" w:color="auto"/>
+              <w:bottom w:val="single" w:sz="4" w:space="0" w:color="auto"/>
+              <w:right w:val="single" w:sz="4" w:space="0" w:color="auto"/>
+            </w:tcBorders>
+            <w:hideMark/>
+          </w:tcPr>
+          <w:p>
+            <w:pPr>
+              <w:tabs>
+                <w:tab w:val="center" w:pos="4677"/>
+                <w:tab w:val="left" w:pos="7873"/>
+              </w:tabs>
+              <w:jc w:val="center"/>
+              <w:rPr>
+                <w:rFonts w:ascii="Times New Roman" w:hAnsi="Times New Roman" w:cs="Times New Roman"/>
+                <w:sz w:val="28"/>
+                <w:szCs w:val="28"/>
+                <w:lang w:eastAsia="ru-RU"/>
+              </w:rPr>
+            </w:pPr>
+            <w:r>
+              <w:rPr>
+                <w:rFonts w:ascii="Times New Roman" w:hAnsi="Times New Roman" w:cs="Times New Roman"/>
+                <w:sz w:val="28"/>
+                <w:szCs w:val="28"/>
+                <w:lang w:eastAsia="ru-RU"/>
+              </w:rPr>
+              <w:t>0,3</w:t>
+            </w:r>
+          </w:p>
+        </w:tc>
+        <w:tc>
+          <w:tcPr>
+            <w:tcW w:w="2331" w:type="dxa"/>
+            <w:tcBorders>
+              <w:top w:val="single" w:sz="4" w:space="0" w:color="auto"/>
+              <w:left w:val="single" w:sz="4" w:space="0" w:color="auto"/>
+              <w:bottom w:val="single" w:sz="4" w:space="0" w:color="auto"/>
+              <w:right w:val="single" w:sz="4" w:space="0" w:color="auto"/>
+            </w:tcBorders>
+            <w:hideMark/>
+          </w:tcPr>
+          <w:p>
+            <w:pPr>
+              <w:tabs>
+                <w:tab w:val="center" w:pos="4677"/>
+                <w:tab w:val="left" w:pos="7873"/>
+              </w:tabs>
+              <w:jc w:val="center"/>
+              <w:rPr>
+                <w:rFonts w:ascii="Times New Roman" w:hAnsi="Times New Roman" w:cs="Times New Roman"/>
+                <w:sz w:val="28"/>
+                <w:szCs w:val="28"/>
+                <w:lang w:eastAsia="ru-RU"/>
+              </w:rPr>
+            </w:pPr>
+            <w:r>
+              <w:rPr>
+                <w:rFonts w:ascii="Times New Roman" w:hAnsi="Times New Roman" w:cs="Times New Roman"/>
+                <w:sz w:val="28"/>
+                <w:szCs w:val="28"/>
+                <w:lang w:eastAsia="ru-RU"/>
+              </w:rPr>
+              <w:t>0,4</w:t>
+            </w:r>
+          </w:p>
+        </w:tc>
+        <w:tc>
+          <w:tcPr>
+            <w:tcW w:w="2193" w:type="dxa"/>
+            <w:tcBorders>
+              <w:top w:val="single" w:sz="4" w:space="0" w:color="auto"/>
+              <w:left w:val="single" w:sz="4" w:space="0" w:color="auto"/>
+              <w:bottom w:val="single" w:sz="4" w:space="0" w:color="auto"/>
+              <w:right w:val="single" w:sz="4" w:space="0" w:color="auto"/>
+            </w:tcBorders>
+          </w:tcPr>
+          <w:p>
+            <w:pPr>
+              <w:tabs>
+                <w:tab w:val="center" w:pos="4677"/>
+                <w:tab w:val="left" w:pos="7873"/>
+              </w:tabs>
+              <w:jc w:val="center"/>
+              <w:rPr>
+                <w:rFonts w:ascii="Times New Roman" w:hAnsi="Times New Roman" w:cs="Times New Roman"/>
+                <w:sz w:val="28"/>
+                <w:szCs w:val="28"/>
+                <w:lang w:eastAsia="ru-RU"/>
+              </w:rPr>
+            </w:pPr>
+            <w:r>
+              <w:rPr>
+                <w:rFonts w:ascii="Times New Roman" w:hAnsi="Times New Roman" w:cs="Times New Roman"/>
+                <w:sz w:val="28"/>
+                <w:szCs w:val="28"/>
+                <w:lang w:eastAsia="ru-RU"/>
+              </w:rPr>
+              <w:t>0,15</w:t>
+            </w:r>
+          </w:p>
+        </w:tc>
+      </w:tr>
+    </w:tbl>
+    <w:p>
+      <w:pPr>
+        <w:rPr>
+          <w:rFonts w:ascii="Times New Roman" w:hAnsi="Times New Roman" w:cs="Times New Roman"/>
+          <w:b/>
+          <w:sz w:val="28"/>
+        </w:rPr>
+      </w:pPr>
+    </w:p>
+    <w:p>
+      <w:pPr>
+        <w:jc w:val="center"/>
+        <w:rPr>
+          <w:rFonts w:ascii="Times New Roman" w:hAnsi="Times New Roman" w:cs="Times New Roman"/>
+          <w:sz w:val="28"/>
+        </w:rPr>
+      </w:pPr>
+      <w:r>
+        <w:rPr>
+          <w:rFonts w:ascii="Times New Roman" w:hAnsi="Times New Roman" w:cs="Times New Roman"/>
+          <w:noProof/>
+          <w:sz w:val="28"/>
+          <w:lang w:eastAsia="ru-RU"/>
+        </w:rPr>
+        <w:drawing>
+          <wp:inline distT="0" distB="0" distL="0" distR="0" wp14:anchorId="4258061E" wp14:editId="452083ED">
+            <wp:extent cx="4762556" cy="3104866"/>
+            <wp:effectExtent l="0" t="0" r="0" b="635"/>
+            <wp:docPr id="9" name="Рисунок 9"/>
+            <wp:cNvGraphicFramePr>
+              <a:graphicFrameLocks xmlns:a="http://schemas.openxmlformats.org/drawingml/2006/main" noChangeAspect="1"/>
+            </wp:cNvGraphicFramePr>
+            <a:graphic xmlns:a="http://schemas.openxmlformats.org/drawingml/2006/main">
+              <a:graphicData uri="http://schemas.openxmlformats.org/drawingml/2006/picture">
+                <pic:pic xmlns:pic="http://schemas.openxmlformats.org/drawingml/2006/picture">
+                  <pic:nvPicPr>
+                    <pic:cNvPr id="0" name="Рисунок 8"/>
+                    <pic:cNvPicPr>
+                      <a:picLocks noChangeAspect="1" noChangeArrowheads="1"/>
+                    </pic:cNvPicPr>
+                  </pic:nvPicPr>
+                  <pic:blipFill>
+                    <a:blip r:embed="rId12">
+                      <a:extLst>
+                        <a:ext uri="{28A0092B-C50C-407E-A947-70E740481C1C}">
+                          <a14:useLocalDpi xmlns:a14="http://schemas.microsoft.com/office/drawing/2010/main" val="0"/>
+                        </a:ext>
+                      </a:extLst>
+                    </a:blip>
+                    <a:srcRect/>
+                    <a:stretch>
+                      <a:fillRect/>
+                    </a:stretch>
+                  </pic:blipFill>
+                  <pic:spPr bwMode="auto">
+                    <a:xfrm>
+                      <a:off x="0" y="0"/>
+                      <a:ext cx="5001720" cy="3260785"/>
+                    </a:xfrm>
+                    <a:prstGeom prst="rect">
+                      <a:avLst/>
+                    </a:prstGeom>
+                    <a:noFill/>
+                    <a:ln>
+                      <a:noFill/>
+                    </a:ln>
+                  </pic:spPr>
+                </pic:pic>
+              </a:graphicData>
+            </a:graphic>
+          </wp:inline>
+        </w:drawing>
+      </w:r>
+      <w:r>
+        <w:rPr>
+          <w:rFonts w:ascii="Times New Roman" w:hAnsi="Times New Roman" w:cs="Times New Roman"/>
+          <w:sz w:val="28"/>
         </w:rPr>
         <w:br/>
-        <w:t>Рисунок 7 – АЧХ и ФЧХ дифференцирующей цепочки</w:t>
+      </w:r>
+      <w:r>
+        <w:rPr>
+          <w:rFonts w:ascii="Times New Roman" w:hAnsi="Times New Roman" w:cs="Times New Roman"/>
+          <w:sz w:val="24"/>
+        </w:rPr>
+        <w:t xml:space="preserve">Рисунок 7 — </w:t>
+      </w:r>
+      <w:r>
+        <w:rPr>
+          <w:rFonts w:ascii="Times New Roman" w:hAnsi="Times New Roman" w:cs="Times New Roman"/>
+          <w:sz w:val="24"/>
+          <w:szCs w:val="28"/>
+        </w:rPr>
+        <w:t>Осциллограмма при частоте 10 кГц</w:t>
+      </w:r>
+    </w:p>
+    <w:p>
+      <w:pPr>
+        <w:jc w:val="center"/>
+        <w:rPr>
+          <w:rFonts w:ascii="Times New Roman" w:hAnsi="Times New Roman" w:cs="Times New Roman"/>
+          <w:sz w:val="24"/>
+          <w:szCs w:val="28"/>
+        </w:rPr>
+      </w:pPr>
+      <w:r>
+        <w:rPr>
+          <w:rFonts w:ascii="Times New Roman" w:hAnsi="Times New Roman" w:cs="Times New Roman"/>
+          <w:noProof/>
+          <w:sz w:val="28"/>
+          <w:lang w:eastAsia="ru-RU"/>
+        </w:rPr>
+        <w:lastRenderedPageBreak/>
+        <w:drawing>
+          <wp:inline distT="0" distB="0" distL="0" distR="0" wp14:anchorId="45EF9546" wp14:editId="425709B1">
+            <wp:extent cx="4922875" cy="3247316"/>
+            <wp:effectExtent l="0" t="0" r="0" b="0"/>
+            <wp:docPr id="8" name="Рисунок 8"/>
+            <wp:cNvGraphicFramePr>
+              <a:graphicFrameLocks xmlns:a="http://schemas.openxmlformats.org/drawingml/2006/main" noChangeAspect="1"/>
+            </wp:cNvGraphicFramePr>
+            <a:graphic xmlns:a="http://schemas.openxmlformats.org/drawingml/2006/main">
+              <a:graphicData uri="http://schemas.openxmlformats.org/drawingml/2006/picture">
+                <pic:pic xmlns:pic="http://schemas.openxmlformats.org/drawingml/2006/picture">
+                  <pic:nvPicPr>
+                    <pic:cNvPr id="0" name="Рисунок 9"/>
+                    <pic:cNvPicPr>
+                      <a:picLocks noChangeAspect="1" noChangeArrowheads="1"/>
+                    </pic:cNvPicPr>
+                  </pic:nvPicPr>
+                  <pic:blipFill>
+                    <a:blip r:embed="rId13">
+                      <a:extLst>
+                        <a:ext uri="{28A0092B-C50C-407E-A947-70E740481C1C}">
+                          <a14:useLocalDpi xmlns:a14="http://schemas.microsoft.com/office/drawing/2010/main" val="0"/>
+                        </a:ext>
+                      </a:extLst>
+                    </a:blip>
+                    <a:srcRect/>
+                    <a:stretch>
+                      <a:fillRect/>
+                    </a:stretch>
+                  </pic:blipFill>
+                  <pic:spPr bwMode="auto">
+                    <a:xfrm>
+                      <a:off x="0" y="0"/>
+                      <a:ext cx="4971481" cy="3279379"/>
+                    </a:xfrm>
+                    <a:prstGeom prst="rect">
+                      <a:avLst/>
+                    </a:prstGeom>
+                    <a:noFill/>
+                    <a:ln>
+                      <a:noFill/>
+                    </a:ln>
+                  </pic:spPr>
+                </pic:pic>
+              </a:graphicData>
+            </a:graphic>
+          </wp:inline>
+        </w:drawing>
+      </w:r>
+      <w:r>
+        <w:rPr>
+          <w:rFonts w:ascii="Times New Roman" w:hAnsi="Times New Roman" w:cs="Times New Roman"/>
+          <w:sz w:val="28"/>
+        </w:rPr>
+        <w:br/>
+      </w:r>
+      <w:r>
+        <w:rPr>
+          <w:rFonts w:ascii="Times New Roman" w:hAnsi="Times New Roman" w:cs="Times New Roman"/>
+          <w:sz w:val="24"/>
+        </w:rPr>
+        <w:t xml:space="preserve">Рисунок 8 — </w:t>
+      </w:r>
+      <w:r>
+        <w:rPr>
+          <w:rFonts w:ascii="Times New Roman" w:hAnsi="Times New Roman" w:cs="Times New Roman"/>
+          <w:sz w:val="24"/>
+          <w:szCs w:val="28"/>
+        </w:rPr>
+        <w:t>Осциллограмма при частоте 50 кГц</w:t>
+      </w:r>
+    </w:p>
+    <w:p>
+      <w:pPr>
+        <w:jc w:val="center"/>
+        <w:rPr>
+          <w:rFonts w:ascii="Times New Roman" w:hAnsi="Times New Roman" w:cs="Times New Roman"/>
+          <w:sz w:val="28"/>
+        </w:rPr>
+      </w:pPr>
+    </w:p>
+    <w:p>
+      <w:pPr>
+        <w:tabs>
+          <w:tab w:val="center" w:pos="4677"/>
+          <w:tab w:val="left" w:pos="7873"/>
+        </w:tabs>
+        <w:jc w:val="center"/>
+        <w:rPr>
+          <w:rFonts w:ascii="Times New Roman" w:hAnsi="Times New Roman" w:cs="Times New Roman"/>
+          <w:sz w:val="24"/>
+          <w:szCs w:val="28"/>
+        </w:rPr>
+      </w:pPr>
+      <w:r>
+        <w:rPr>
+          <w:rFonts w:ascii="Times New Roman" w:hAnsi="Times New Roman" w:cs="Times New Roman"/>
+          <w:noProof/>
+          <w:sz w:val="32"/>
+          <w:szCs w:val="28"/>
+          <w:lang w:eastAsia="ru-RU"/>
+        </w:rPr>
+        <w:drawing>
+          <wp:inline distT="0" distB="0" distL="0" distR="0" wp14:anchorId="133E793F" wp14:editId="38091366">
+            <wp:extent cx="4997303" cy="3271808"/>
+            <wp:effectExtent l="0" t="0" r="0" b="5080"/>
+            <wp:docPr id="7" name="Рисунок 7"/>
+            <wp:cNvGraphicFramePr>
+              <a:graphicFrameLocks xmlns:a="http://schemas.openxmlformats.org/drawingml/2006/main" noChangeAspect="1"/>
+            </wp:cNvGraphicFramePr>
+            <a:graphic xmlns:a="http://schemas.openxmlformats.org/drawingml/2006/main">
+              <a:graphicData uri="http://schemas.openxmlformats.org/drawingml/2006/picture">
+                <pic:pic xmlns:pic="http://schemas.openxmlformats.org/drawingml/2006/picture">
+                  <pic:nvPicPr>
+                    <pic:cNvPr id="0" name="Рисунок 13"/>
+                    <pic:cNvPicPr>
+                      <a:picLocks noChangeAspect="1" noChangeArrowheads="1"/>
+                    </pic:cNvPicPr>
+                  </pic:nvPicPr>
+                  <pic:blipFill>
+                    <a:blip r:embed="rId14">
+                      <a:extLst>
+                        <a:ext uri="{28A0092B-C50C-407E-A947-70E740481C1C}">
+                          <a14:useLocalDpi xmlns:a14="http://schemas.microsoft.com/office/drawing/2010/main" val="0"/>
+                        </a:ext>
+                      </a:extLst>
+                    </a:blip>
+                    <a:srcRect/>
+                    <a:stretch>
+                      <a:fillRect/>
+                    </a:stretch>
+                  </pic:blipFill>
+                  <pic:spPr bwMode="auto">
+                    <a:xfrm>
+                      <a:off x="0" y="0"/>
+                      <a:ext cx="5048414" cy="3305271"/>
+                    </a:xfrm>
+                    <a:prstGeom prst="rect">
+                      <a:avLst/>
+                    </a:prstGeom>
+                    <a:noFill/>
+                    <a:ln>
+                      <a:noFill/>
+                    </a:ln>
+                  </pic:spPr>
+                </pic:pic>
+              </a:graphicData>
+            </a:graphic>
+          </wp:inline>
+        </w:drawing>
+      </w:r>
+      <w:r>
+        <w:rPr>
+          <w:rFonts w:ascii="Times New Roman" w:hAnsi="Times New Roman" w:cs="Times New Roman"/>
+          <w:sz w:val="32"/>
+          <w:szCs w:val="28"/>
+        </w:rPr>
+        <w:br/>
+      </w:r>
+      <w:r>
+        <w:rPr>
+          <w:rFonts w:ascii="Times New Roman" w:hAnsi="Times New Roman" w:cs="Times New Roman"/>
+          <w:sz w:val="24"/>
+        </w:rPr>
+        <w:t xml:space="preserve">Рисунок 9 — </w:t>
+      </w:r>
+      <w:r>
+        <w:rPr>
+          <w:rFonts w:ascii="Times New Roman" w:hAnsi="Times New Roman" w:cs="Times New Roman"/>
+          <w:sz w:val="24"/>
+          <w:szCs w:val="28"/>
+        </w:rPr>
+        <w:t>Осциллограмма при частоте 100 кГц</w:t>
+      </w:r>
+    </w:p>
+    <w:p>
+      <w:pPr>
+        <w:jc w:val="center"/>
+        <w:rPr>
+          <w:rFonts w:ascii="Times New Roman" w:hAnsi="Times New Roman" w:cs="Times New Roman"/>
+          <w:b/>
+          <w:sz w:val="28"/>
+        </w:rPr>
+      </w:pPr>
+    </w:p>
+    <w:p>
+      <w:pPr>
+        <w:rPr>
+          <w:rFonts w:ascii="Times New Roman" w:hAnsi="Times New Roman" w:cs="Times New Roman"/>
+          <w:b/>
+          <w:sz w:val="28"/>
+        </w:rPr>
+      </w:pPr>
+      <w:r>
+        <w:rPr>
+          <w:rFonts w:ascii="Times New Roman" w:hAnsi="Times New Roman" w:cs="Times New Roman"/>
+          <w:b/>
+          <w:sz w:val="28"/>
+        </w:rPr>
+        <w:br w:type="page"/>
       </w:r>
     </w:p>
     <w:p>
@@ -1441,35 +4002,24 @@
         <w:jc w:val="center"/>
         <w:rPr>
           <w:rFonts w:ascii="Times New Roman" w:hAnsi="Times New Roman" w:cs="Times New Roman"/>
-          <w:sz w:val="24"/>
-          <w:szCs w:val="24"/>
-        </w:rPr>
-      </w:pPr>
+          <w:b/>
+          <w:sz w:val="28"/>
+        </w:rPr>
+      </w:pPr>
+      <w:r>
+        <w:rPr>
+          <w:rFonts w:ascii="Times New Roman" w:hAnsi="Times New Roman" w:cs="Times New Roman"/>
+          <w:b/>
+          <w:sz w:val="28"/>
+        </w:rPr>
+        <w:lastRenderedPageBreak/>
+        <w:t>Вывод</w:t>
+      </w:r>
     </w:p>
     <w:p>
       <w:pPr>
-        <w:spacing w:line="360" w:lineRule="auto"/>
-        <w:ind w:firstLine="709"/>
-        <w:jc w:val="center"/>
-        <w:rPr>
-          <w:rFonts w:ascii="Times New Roman" w:hAnsi="Times New Roman" w:cs="Times New Roman"/>
-          <w:b/>
-          <w:sz w:val="28"/>
-        </w:rPr>
-      </w:pPr>
-      <w:r>
-        <w:rPr>
-          <w:rFonts w:ascii="Times New Roman" w:hAnsi="Times New Roman" w:cs="Times New Roman"/>
-          <w:b/>
-          <w:sz w:val="28"/>
-        </w:rPr>
-        <w:t>Вывод</w:t>
-      </w:r>
-    </w:p>
-    <w:p>
-      <w:pPr>
         <w:spacing w:after="120" w:line="360" w:lineRule="auto"/>
-        <w:ind w:firstLine="357"/>
+        <w:ind w:firstLine="708"/>
         <w:rPr>
           <w:rFonts w:ascii="Times New Roman" w:eastAsiaTheme="minorEastAsia" w:hAnsi="Times New Roman" w:cs="Times New Roman"/>
           <w:sz w:val="28"/>
@@ -1480,39 +4030,23 @@
         <w:rPr>
           <w:rFonts w:ascii="Times New Roman" w:hAnsi="Times New Roman" w:cs="Times New Roman"/>
           <w:sz w:val="28"/>
-          <w:szCs w:val="20"/>
-        </w:rPr>
-        <w:t xml:space="preserve">В ходе лабораторной работы были исследованы </w:t>
-      </w:r>
-      <w:r>
-        <w:rPr>
-          <w:rFonts w:ascii="Times New Roman" w:hAnsi="Times New Roman" w:cs="Times New Roman"/>
-          <w:sz w:val="28"/>
-          <w:szCs w:val="24"/>
-        </w:rPr>
-        <w:t>цепи постоянного и переменного тока. Также были приобретены практически</w:t>
-      </w:r>
-      <w:r>
-        <w:rPr>
-          <w:rFonts w:ascii="Times New Roman" w:hAnsi="Times New Roman" w:cs="Times New Roman"/>
-          <w:sz w:val="28"/>
-          <w:szCs w:val="24"/>
-        </w:rPr>
-        <w:t>е</w:t>
-      </w:r>
-      <w:r>
-        <w:rPr>
-          <w:rFonts w:ascii="Times New Roman" w:hAnsi="Times New Roman" w:cs="Times New Roman"/>
-          <w:sz w:val="28"/>
-          <w:szCs w:val="24"/>
-        </w:rPr>
-        <w:t xml:space="preserve"> навык</w:t>
-      </w:r>
-      <w:r>
-        <w:rPr>
-          <w:rFonts w:ascii="Times New Roman" w:hAnsi="Times New Roman" w:cs="Times New Roman"/>
-          <w:sz w:val="28"/>
-          <w:szCs w:val="24"/>
+          <w:szCs w:val="28"/>
+        </w:rPr>
+        <w:t>В ходе выполнения лабораторной работы были исследованы</w:t>
+      </w:r>
+      <w:r>
+        <w:rPr>
+          <w:rFonts w:ascii="Times New Roman" w:hAnsi="Times New Roman" w:cs="Times New Roman"/>
+          <w:sz w:val="28"/>
+          <w:szCs w:val="28"/>
+        </w:rPr>
+        <w:t xml:space="preserve"> характеристик</w:t>
+      </w:r>
+      <w:r>
+        <w:rPr>
+          <w:rFonts w:ascii="Times New Roman" w:hAnsi="Times New Roman" w:cs="Times New Roman"/>
+          <w:sz w:val="28"/>
+          <w:szCs w:val="28"/>
         </w:rPr>
         <w:t>и</w:t>
       </w:r>
@@ -1520,9 +4054,41 @@
         <w:rPr>
           <w:rFonts w:ascii="Times New Roman" w:hAnsi="Times New Roman" w:cs="Times New Roman"/>
           <w:sz w:val="28"/>
-          <w:szCs w:val="24"/>
-        </w:rPr>
-        <w:t xml:space="preserve"> измерения электрических параметров с помощью электро- и радиоизмерительных приборов.</w:t>
+          <w:szCs w:val="28"/>
+        </w:rPr>
+        <w:t xml:space="preserve"> биполярных и униполярных транзистор</w:t>
+      </w:r>
+      <w:r>
+        <w:rPr>
+          <w:rFonts w:ascii="Times New Roman" w:hAnsi="Times New Roman" w:cs="Times New Roman"/>
+          <w:sz w:val="28"/>
+          <w:szCs w:val="28"/>
+        </w:rPr>
+        <w:t>ов и ключевых схем. Приобретены практические навыки</w:t>
+      </w:r>
+      <w:r>
+        <w:rPr>
+          <w:rFonts w:ascii="Times New Roman" w:hAnsi="Times New Roman" w:cs="Times New Roman"/>
+          <w:sz w:val="28"/>
+          <w:szCs w:val="28"/>
+        </w:rPr>
+        <w:t xml:space="preserve"> измерения электрических параметров </w:t>
+      </w:r>
+      <w:r>
+        <w:rPr>
+          <w:rFonts w:ascii="Times New Roman" w:hAnsi="Times New Roman" w:cs="Times New Roman"/>
+          <w:sz w:val="28"/>
+          <w:szCs w:val="28"/>
+        </w:rPr>
+        <w:t xml:space="preserve">транзисторов (биполярных и КМОП) </w:t>
+      </w:r>
+      <w:r>
+        <w:rPr>
+          <w:rFonts w:ascii="Times New Roman" w:hAnsi="Times New Roman" w:cs="Times New Roman"/>
+          <w:sz w:val="28"/>
+          <w:szCs w:val="28"/>
+        </w:rPr>
+        <w:t>и регистрации временных диаграмм с помощью электро- и радиоизмерительных приборов.</w:t>
       </w:r>
     </w:p>
     <w:sectPr>
@@ -2082,7 +4648,7 @@
     <w:lsdException w:name="Table Web 2" w:semiHidden="1" w:unhideWhenUsed="1"/>
     <w:lsdException w:name="Table Web 3" w:semiHidden="1" w:unhideWhenUsed="1"/>
     <w:lsdException w:name="Balloon Text" w:semiHidden="1" w:unhideWhenUsed="1"/>
-    <w:lsdException w:name="Table Grid" w:uiPriority="39"/>
+    <w:lsdException w:name="Table Grid" w:uiPriority="39" w:qFormat="1"/>
     <w:lsdException w:name="Table Theme" w:semiHidden="1" w:unhideWhenUsed="1"/>
     <w:lsdException w:name="Placeholder Text" w:semiHidden="1"/>
     <w:lsdException w:name="No Spacing" w:uiPriority="1" w:qFormat="1"/>
@@ -2828,6 +5394,7 @@
     <w:name w:val="Table Grid"/>
     <w:basedOn w:val="a1"/>
     <w:uiPriority w:val="39"/>
+    <w:qFormat/>
     <w:rsid w:val="002F45AD"/>
     <w:pPr>
       <w:spacing w:after="0" w:line="240" w:lineRule="auto"/>
@@ -2842,6 +5409,16 @@
         <w:insideV w:val="single" w:sz="4" w:space="0" w:color="auto"/>
       </w:tblBorders>
     </w:tblPr>
+  </w:style>
+  <w:style w:type="character" w:styleId="ad">
+    <w:name w:val="Placeholder Text"/>
+    <w:basedOn w:val="a0"/>
+    <w:uiPriority w:val="99"/>
+    <w:semiHidden/>
+    <w:rsid w:val="00C94D9F"/>
+    <w:rPr>
+      <w:color w:val="808080"/>
+    </w:rPr>
   </w:style>
 </w:styles>
 </file>
@@ -3139,4 +5716,16 @@
     </a:ext>
   </a:extLst>
 </a:theme>
+</file>
+
+<file path=customXml/item1.xml><?xml version="1.0" encoding="utf-8"?>
+<b:Sources xmlns:b="http://schemas.openxmlformats.org/officeDocument/2006/bibliography" xmlns="http://schemas.openxmlformats.org/officeDocument/2006/bibliography" SelectedStyle="\APASixthEditionOfficeOnline.xsl" StyleName="APA" Version="6"/>
+</file>
+
+<file path=customXml/itemProps1.xml><?xml version="1.0" encoding="utf-8"?>
+<ds:datastoreItem xmlns:ds="http://schemas.openxmlformats.org/officeDocument/2006/customXml" ds:itemID="{390B3C5D-2ACE-498A-B916-3BC97EDE0634}">
+  <ds:schemaRefs>
+    <ds:schemaRef ds:uri="http://schemas.openxmlformats.org/officeDocument/2006/bibliography"/>
+  </ds:schemaRefs>
+</ds:datastoreItem>
 </file>
</xml_diff>